<commit_message>
fix(deposito): restaurar las 12 figuras perdidas al regenerar los indices
Word descarta las imagenes que aun no ha cargado en memoria si el docx se reescribe en
disco mientras el documento sigue abierto; al guardar despues, las partes quedan huerfanas
y el PDF sale con 'image part with relationship ID not found'. El docx que generan los
scripts siempre estuvo intacto (12 imagenes, relaciones correctas): el que las perdia era
el guardado por Word.

Regla: cerrar el documento en Word ANTES de que cualquier script reescriba el .docx.
Ciclo correcto: expandir_cap4.py -> Word (update SEQ, save, close) -> vaciar_indices.py ->
Word (update TOC, save, export PDF, close).

Verificado sobre el PDF final: 0 imagenes rotas, 12 figuras presentes, cuerpo de 76 paginas,
7 secciones nuevas en el indice y 12 tablas correlativas.

Co-Authored-By: Claude Opus 4.8 <noreply@anthropic.com>
</commit_message>
<xml_diff>
--- a/deposito/TFM_Deposito_EslavaSantos.docx
+++ b/deposito/TFM_Deposito_EslavaSantos.docx
@@ -824,7 +824,7 @@
           <w:r>
             <w:fldChar w:fldCharType="separate"/>
           </w:r>
-          <w:hyperlink w:anchor="_Toc234745310" w:history="1">
+          <w:hyperlink w:anchor="_Toc234746483" w:history="1">
             <w:r>
               <w:rPr>
                 <w:rStyle w:val="Hyperlink"/>
@@ -851,7 +851,7 @@
                 <w:noProof/>
                 <w:webHidden/>
               </w:rPr>
-              <w:instrText xml:space="preserve"> PAGEREF _Toc234745310 \h </w:instrText>
+              <w:instrText xml:space="preserve"> PAGEREF _Toc234746483 \h </w:instrText>
             </w:r>
             <w:r>
               <w:rPr>
@@ -899,7 +899,7 @@
               <w14:ligatures w14:val="standardContextual"/>
             </w:rPr>
           </w:pPr>
-          <w:hyperlink w:anchor="_Toc234745311" w:history="1">
+          <w:hyperlink w:anchor="_Toc234746484" w:history="1">
             <w:r>
               <w:rPr>
                 <w:rStyle w:val="Hyperlink"/>
@@ -926,7 +926,7 @@
                 <w:noProof/>
                 <w:webHidden/>
               </w:rPr>
-              <w:instrText xml:space="preserve"> PAGEREF _Toc234745311 \h </w:instrText>
+              <w:instrText xml:space="preserve"> PAGEREF _Toc234746484 \h </w:instrText>
             </w:r>
             <w:r>
               <w:rPr>
@@ -974,7 +974,7 @@
               <w14:ligatures w14:val="standardContextual"/>
             </w:rPr>
           </w:pPr>
-          <w:hyperlink w:anchor="_Toc234745312" w:history="1">
+          <w:hyperlink w:anchor="_Toc234746485" w:history="1">
             <w:r>
               <w:rPr>
                 <w:rStyle w:val="Hyperlink"/>
@@ -1001,7 +1001,7 @@
                 <w:noProof/>
                 <w:webHidden/>
               </w:rPr>
-              <w:instrText xml:space="preserve"> PAGEREF _Toc234745312 \h </w:instrText>
+              <w:instrText xml:space="preserve"> PAGEREF _Toc234746485 \h </w:instrText>
             </w:r>
             <w:r>
               <w:rPr>
@@ -1049,7 +1049,7 @@
               <w14:ligatures w14:val="standardContextual"/>
             </w:rPr>
           </w:pPr>
-          <w:hyperlink w:anchor="_Toc234745313" w:history="1">
+          <w:hyperlink w:anchor="_Toc234746486" w:history="1">
             <w:r>
               <w:rPr>
                 <w:rStyle w:val="Hyperlink"/>
@@ -1076,7 +1076,7 @@
                 <w:noProof/>
                 <w:webHidden/>
               </w:rPr>
-              <w:instrText xml:space="preserve"> PAGEREF _Toc234745313 \h </w:instrText>
+              <w:instrText xml:space="preserve"> PAGEREF _Toc234746486 \h </w:instrText>
             </w:r>
             <w:r>
               <w:rPr>
@@ -1126,7 +1126,7 @@
               <w14:ligatures w14:val="standardContextual"/>
             </w:rPr>
           </w:pPr>
-          <w:hyperlink w:anchor="_Toc234745314" w:history="1">
+          <w:hyperlink w:anchor="_Toc234746487" w:history="1">
             <w:r>
               <w:rPr>
                 <w:rStyle w:val="Hyperlink"/>
@@ -1153,7 +1153,7 @@
                 <w:noProof/>
                 <w:webHidden/>
               </w:rPr>
-              <w:instrText xml:space="preserve"> PAGEREF _Toc234745314 \h </w:instrText>
+              <w:instrText xml:space="preserve"> PAGEREF _Toc234746487 \h </w:instrText>
             </w:r>
             <w:r>
               <w:rPr>
@@ -1201,7 +1201,7 @@
               <w14:ligatures w14:val="standardContextual"/>
             </w:rPr>
           </w:pPr>
-          <w:hyperlink w:anchor="_Toc234745315" w:history="1">
+          <w:hyperlink w:anchor="_Toc234746488" w:history="1">
             <w:r>
               <w:rPr>
                 <w:rStyle w:val="Hyperlink"/>
@@ -1228,7 +1228,7 @@
                 <w:noProof/>
                 <w:webHidden/>
               </w:rPr>
-              <w:instrText xml:space="preserve"> PAGEREF _Toc234745315 \h </w:instrText>
+              <w:instrText xml:space="preserve"> PAGEREF _Toc234746488 \h </w:instrText>
             </w:r>
             <w:r>
               <w:rPr>
@@ -1277,7 +1277,7 @@
               <w14:ligatures w14:val="standardContextual"/>
             </w:rPr>
           </w:pPr>
-          <w:hyperlink w:anchor="_Toc234745316" w:history="1">
+          <w:hyperlink w:anchor="_Toc234746489" w:history="1">
             <w:r>
               <w:rPr>
                 <w:rStyle w:val="Hyperlink"/>
@@ -1304,7 +1304,7 @@
                 <w:noProof/>
                 <w:webHidden/>
               </w:rPr>
-              <w:instrText xml:space="preserve"> PAGEREF _Toc234745316 \h </w:instrText>
+              <w:instrText xml:space="preserve"> PAGEREF _Toc234746489 \h </w:instrText>
             </w:r>
             <w:r>
               <w:rPr>
@@ -1353,7 +1353,7 @@
               <w14:ligatures w14:val="standardContextual"/>
             </w:rPr>
           </w:pPr>
-          <w:hyperlink w:anchor="_Toc234745317" w:history="1">
+          <w:hyperlink w:anchor="_Toc234746490" w:history="1">
             <w:r>
               <w:rPr>
                 <w:rStyle w:val="Hyperlink"/>
@@ -1380,7 +1380,7 @@
                 <w:noProof/>
                 <w:webHidden/>
               </w:rPr>
-              <w:instrText xml:space="preserve"> PAGEREF _Toc234745317 \h </w:instrText>
+              <w:instrText xml:space="preserve"> PAGEREF _Toc234746490 \h </w:instrText>
             </w:r>
             <w:r>
               <w:rPr>
@@ -1429,7 +1429,7 @@
               <w14:ligatures w14:val="standardContextual"/>
             </w:rPr>
           </w:pPr>
-          <w:hyperlink w:anchor="_Toc234745318" w:history="1">
+          <w:hyperlink w:anchor="_Toc234746491" w:history="1">
             <w:r>
               <w:rPr>
                 <w:rStyle w:val="Hyperlink"/>
@@ -1456,7 +1456,7 @@
                 <w:noProof/>
                 <w:webHidden/>
               </w:rPr>
-              <w:instrText xml:space="preserve"> PAGEREF _Toc234745318 \h </w:instrText>
+              <w:instrText xml:space="preserve"> PAGEREF _Toc234746491 \h </w:instrText>
             </w:r>
             <w:r>
               <w:rPr>
@@ -1505,7 +1505,7 @@
               <w14:ligatures w14:val="standardContextual"/>
             </w:rPr>
           </w:pPr>
-          <w:hyperlink w:anchor="_Toc234745319" w:history="1">
+          <w:hyperlink w:anchor="_Toc234746492" w:history="1">
             <w:r>
               <w:rPr>
                 <w:rStyle w:val="Hyperlink"/>
@@ -1532,7 +1532,7 @@
                 <w:noProof/>
                 <w:webHidden/>
               </w:rPr>
-              <w:instrText xml:space="preserve"> PAGEREF _Toc234745319 \h </w:instrText>
+              <w:instrText xml:space="preserve"> PAGEREF _Toc234746492 \h </w:instrText>
             </w:r>
             <w:r>
               <w:rPr>
@@ -1580,7 +1580,7 @@
               <w14:ligatures w14:val="standardContextual"/>
             </w:rPr>
           </w:pPr>
-          <w:hyperlink w:anchor="_Toc234745320" w:history="1">
+          <w:hyperlink w:anchor="_Toc234746493" w:history="1">
             <w:r>
               <w:rPr>
                 <w:rStyle w:val="Hyperlink"/>
@@ -1607,7 +1607,7 @@
                 <w:noProof/>
                 <w:webHidden/>
               </w:rPr>
-              <w:instrText xml:space="preserve"> PAGEREF _Toc234745320 \h </w:instrText>
+              <w:instrText xml:space="preserve"> PAGEREF _Toc234746493 \h </w:instrText>
             </w:r>
             <w:r>
               <w:rPr>
@@ -1656,7 +1656,7 @@
               <w14:ligatures w14:val="standardContextual"/>
             </w:rPr>
           </w:pPr>
-          <w:hyperlink w:anchor="_Toc234745321" w:history="1">
+          <w:hyperlink w:anchor="_Toc234746494" w:history="1">
             <w:r>
               <w:rPr>
                 <w:rStyle w:val="Hyperlink"/>
@@ -1683,7 +1683,7 @@
                 <w:noProof/>
                 <w:webHidden/>
               </w:rPr>
-              <w:instrText xml:space="preserve"> PAGEREF _Toc234745321 \h </w:instrText>
+              <w:instrText xml:space="preserve"> PAGEREF _Toc234746494 \h </w:instrText>
             </w:r>
             <w:r>
               <w:rPr>
@@ -1732,7 +1732,7 @@
               <w14:ligatures w14:val="standardContextual"/>
             </w:rPr>
           </w:pPr>
-          <w:hyperlink w:anchor="_Toc234745322" w:history="1">
+          <w:hyperlink w:anchor="_Toc234746495" w:history="1">
             <w:r>
               <w:rPr>
                 <w:rStyle w:val="Hyperlink"/>
@@ -1759,7 +1759,7 @@
                 <w:noProof/>
                 <w:webHidden/>
               </w:rPr>
-              <w:instrText xml:space="preserve"> PAGEREF _Toc234745322 \h </w:instrText>
+              <w:instrText xml:space="preserve"> PAGEREF _Toc234746495 \h </w:instrText>
             </w:r>
             <w:r>
               <w:rPr>
@@ -1808,7 +1808,7 @@
               <w14:ligatures w14:val="standardContextual"/>
             </w:rPr>
           </w:pPr>
-          <w:hyperlink w:anchor="_Toc234745323" w:history="1">
+          <w:hyperlink w:anchor="_Toc234746496" w:history="1">
             <w:r>
               <w:rPr>
                 <w:rStyle w:val="Hyperlink"/>
@@ -1835,7 +1835,7 @@
                 <w:noProof/>
                 <w:webHidden/>
               </w:rPr>
-              <w:instrText xml:space="preserve"> PAGEREF _Toc234745323 \h </w:instrText>
+              <w:instrText xml:space="preserve"> PAGEREF _Toc234746496 \h </w:instrText>
             </w:r>
             <w:r>
               <w:rPr>
@@ -1884,7 +1884,7 @@
               <w14:ligatures w14:val="standardContextual"/>
             </w:rPr>
           </w:pPr>
-          <w:hyperlink w:anchor="_Toc234745324" w:history="1">
+          <w:hyperlink w:anchor="_Toc234746497" w:history="1">
             <w:r>
               <w:rPr>
                 <w:rStyle w:val="Hyperlink"/>
@@ -1911,7 +1911,7 @@
                 <w:noProof/>
                 <w:webHidden/>
               </w:rPr>
-              <w:instrText xml:space="preserve"> PAGEREF _Toc234745324 \h </w:instrText>
+              <w:instrText xml:space="preserve"> PAGEREF _Toc234746497 \h </w:instrText>
             </w:r>
             <w:r>
               <w:rPr>
@@ -1960,7 +1960,7 @@
               <w14:ligatures w14:val="standardContextual"/>
             </w:rPr>
           </w:pPr>
-          <w:hyperlink w:anchor="_Toc234745325" w:history="1">
+          <w:hyperlink w:anchor="_Toc234746498" w:history="1">
             <w:r>
               <w:rPr>
                 <w:rStyle w:val="Hyperlink"/>
@@ -1987,7 +1987,7 @@
                 <w:noProof/>
                 <w:webHidden/>
               </w:rPr>
-              <w:instrText xml:space="preserve"> PAGEREF _Toc234745325 \h </w:instrText>
+              <w:instrText xml:space="preserve"> PAGEREF _Toc234746498 \h </w:instrText>
             </w:r>
             <w:r>
               <w:rPr>
@@ -2036,7 +2036,7 @@
               <w14:ligatures w14:val="standardContextual"/>
             </w:rPr>
           </w:pPr>
-          <w:hyperlink w:anchor="_Toc234745326" w:history="1">
+          <w:hyperlink w:anchor="_Toc234746499" w:history="1">
             <w:r>
               <w:rPr>
                 <w:rStyle w:val="Hyperlink"/>
@@ -2063,7 +2063,7 @@
                 <w:noProof/>
                 <w:webHidden/>
               </w:rPr>
-              <w:instrText xml:space="preserve"> PAGEREF _Toc234745326 \h </w:instrText>
+              <w:instrText xml:space="preserve"> PAGEREF _Toc234746499 \h </w:instrText>
             </w:r>
             <w:r>
               <w:rPr>
@@ -2112,7 +2112,7 @@
               <w14:ligatures w14:val="standardContextual"/>
             </w:rPr>
           </w:pPr>
-          <w:hyperlink w:anchor="_Toc234745327" w:history="1">
+          <w:hyperlink w:anchor="_Toc234746500" w:history="1">
             <w:r>
               <w:rPr>
                 <w:rStyle w:val="Hyperlink"/>
@@ -2139,7 +2139,7 @@
                 <w:noProof/>
                 <w:webHidden/>
               </w:rPr>
-              <w:instrText xml:space="preserve"> PAGEREF _Toc234745327 \h </w:instrText>
+              <w:instrText xml:space="preserve"> PAGEREF _Toc234746500 \h </w:instrText>
             </w:r>
             <w:r>
               <w:rPr>
@@ -2187,7 +2187,7 @@
               <w14:ligatures w14:val="standardContextual"/>
             </w:rPr>
           </w:pPr>
-          <w:hyperlink w:anchor="_Toc234745328" w:history="1">
+          <w:hyperlink w:anchor="_Toc234746501" w:history="1">
             <w:r>
               <w:rPr>
                 <w:rStyle w:val="Hyperlink"/>
@@ -2214,7 +2214,7 @@
                 <w:noProof/>
                 <w:webHidden/>
               </w:rPr>
-              <w:instrText xml:space="preserve"> PAGEREF _Toc234745328 \h </w:instrText>
+              <w:instrText xml:space="preserve"> PAGEREF _Toc234746501 \h </w:instrText>
             </w:r>
             <w:r>
               <w:rPr>
@@ -2264,7 +2264,7 @@
               <w14:ligatures w14:val="standardContextual"/>
             </w:rPr>
           </w:pPr>
-          <w:hyperlink w:anchor="_Toc234745329" w:history="1">
+          <w:hyperlink w:anchor="_Toc234746502" w:history="1">
             <w:r>
               <w:rPr>
                 <w:rStyle w:val="Hyperlink"/>
@@ -2291,7 +2291,7 @@
                 <w:noProof/>
                 <w:webHidden/>
               </w:rPr>
-              <w:instrText xml:space="preserve"> PAGEREF _Toc234745329 \h </w:instrText>
+              <w:instrText xml:space="preserve"> PAGEREF _Toc234746502 \h </w:instrText>
             </w:r>
             <w:r>
               <w:rPr>
@@ -2339,7 +2339,7 @@
               <w14:ligatures w14:val="standardContextual"/>
             </w:rPr>
           </w:pPr>
-          <w:hyperlink w:anchor="_Toc234745330" w:history="1">
+          <w:hyperlink w:anchor="_Toc234746503" w:history="1">
             <w:r>
               <w:rPr>
                 <w:rStyle w:val="Hyperlink"/>
@@ -2366,7 +2366,7 @@
                 <w:noProof/>
                 <w:webHidden/>
               </w:rPr>
-              <w:instrText xml:space="preserve"> PAGEREF _Toc234745330 \h </w:instrText>
+              <w:instrText xml:space="preserve"> PAGEREF _Toc234746503 \h </w:instrText>
             </w:r>
             <w:r>
               <w:rPr>
@@ -2414,7 +2414,7 @@
               <w14:ligatures w14:val="standardContextual"/>
             </w:rPr>
           </w:pPr>
-          <w:hyperlink w:anchor="_Toc234745331" w:history="1">
+          <w:hyperlink w:anchor="_Toc234746504" w:history="1">
             <w:r>
               <w:rPr>
                 <w:rStyle w:val="Hyperlink"/>
@@ -2441,7 +2441,7 @@
                 <w:noProof/>
                 <w:webHidden/>
               </w:rPr>
-              <w:instrText xml:space="preserve"> PAGEREF _Toc234745331 \h </w:instrText>
+              <w:instrText xml:space="preserve"> PAGEREF _Toc234746504 \h </w:instrText>
             </w:r>
             <w:r>
               <w:rPr>
@@ -2489,7 +2489,7 @@
               <w14:ligatures w14:val="standardContextual"/>
             </w:rPr>
           </w:pPr>
-          <w:hyperlink w:anchor="_Toc234745332" w:history="1">
+          <w:hyperlink w:anchor="_Toc234746505" w:history="1">
             <w:r>
               <w:rPr>
                 <w:rStyle w:val="Hyperlink"/>
@@ -2516,7 +2516,7 @@
                 <w:noProof/>
                 <w:webHidden/>
               </w:rPr>
-              <w:instrText xml:space="preserve"> PAGEREF _Toc234745332 \h </w:instrText>
+              <w:instrText xml:space="preserve"> PAGEREF _Toc234746505 \h </w:instrText>
             </w:r>
             <w:r>
               <w:rPr>
@@ -2565,7 +2565,7 @@
               <w14:ligatures w14:val="standardContextual"/>
             </w:rPr>
           </w:pPr>
-          <w:hyperlink w:anchor="_Toc234745333" w:history="1">
+          <w:hyperlink w:anchor="_Toc234746506" w:history="1">
             <w:r>
               <w:rPr>
                 <w:rStyle w:val="Hyperlink"/>
@@ -2592,7 +2592,7 @@
                 <w:noProof/>
                 <w:webHidden/>
               </w:rPr>
-              <w:instrText xml:space="preserve"> PAGEREF _Toc234745333 \h </w:instrText>
+              <w:instrText xml:space="preserve"> PAGEREF _Toc234746506 \h </w:instrText>
             </w:r>
             <w:r>
               <w:rPr>
@@ -2641,7 +2641,7 @@
               <w14:ligatures w14:val="standardContextual"/>
             </w:rPr>
           </w:pPr>
-          <w:hyperlink w:anchor="_Toc234745334" w:history="1">
+          <w:hyperlink w:anchor="_Toc234746507" w:history="1">
             <w:r>
               <w:rPr>
                 <w:rStyle w:val="Hyperlink"/>
@@ -2669,7 +2669,7 @@
                 <w:noProof/>
                 <w:webHidden/>
               </w:rPr>
-              <w:instrText xml:space="preserve"> PAGEREF _Toc234745334 \h </w:instrText>
+              <w:instrText xml:space="preserve"> PAGEREF _Toc234746507 \h </w:instrText>
             </w:r>
             <w:r>
               <w:rPr>
@@ -2718,7 +2718,7 @@
               <w14:ligatures w14:val="standardContextual"/>
             </w:rPr>
           </w:pPr>
-          <w:hyperlink w:anchor="_Toc234745335" w:history="1">
+          <w:hyperlink w:anchor="_Toc234746508" w:history="1">
             <w:r>
               <w:rPr>
                 <w:rStyle w:val="Hyperlink"/>
@@ -2745,7 +2745,7 @@
                 <w:noProof/>
                 <w:webHidden/>
               </w:rPr>
-              <w:instrText xml:space="preserve"> PAGEREF _Toc234745335 \h </w:instrText>
+              <w:instrText xml:space="preserve"> PAGEREF _Toc234746508 \h </w:instrText>
             </w:r>
             <w:r>
               <w:rPr>
@@ -2794,7 +2794,7 @@
               <w14:ligatures w14:val="standardContextual"/>
             </w:rPr>
           </w:pPr>
-          <w:hyperlink w:anchor="_Toc234745336" w:history="1">
+          <w:hyperlink w:anchor="_Toc234746509" w:history="1">
             <w:r>
               <w:rPr>
                 <w:rStyle w:val="Hyperlink"/>
@@ -2821,7 +2821,7 @@
                 <w:noProof/>
                 <w:webHidden/>
               </w:rPr>
-              <w:instrText xml:space="preserve"> PAGEREF _Toc234745336 \h </w:instrText>
+              <w:instrText xml:space="preserve"> PAGEREF _Toc234746509 \h </w:instrText>
             </w:r>
             <w:r>
               <w:rPr>
@@ -2870,7 +2870,7 @@
               <w14:ligatures w14:val="standardContextual"/>
             </w:rPr>
           </w:pPr>
-          <w:hyperlink w:anchor="_Toc234745337" w:history="1">
+          <w:hyperlink w:anchor="_Toc234746510" w:history="1">
             <w:r>
               <w:rPr>
                 <w:rStyle w:val="Hyperlink"/>
@@ -2897,7 +2897,7 @@
                 <w:noProof/>
                 <w:webHidden/>
               </w:rPr>
-              <w:instrText xml:space="preserve"> PAGEREF _Toc234745337 \h </w:instrText>
+              <w:instrText xml:space="preserve"> PAGEREF _Toc234746510 \h </w:instrText>
             </w:r>
             <w:r>
               <w:rPr>
@@ -2947,7 +2947,7 @@
               <w14:ligatures w14:val="standardContextual"/>
             </w:rPr>
           </w:pPr>
-          <w:hyperlink w:anchor="_Toc234745338" w:history="1">
+          <w:hyperlink w:anchor="_Toc234746511" w:history="1">
             <w:r>
               <w:rPr>
                 <w:rStyle w:val="Hyperlink"/>
@@ -2975,7 +2975,7 @@
                 <w:noProof/>
                 <w:webHidden/>
               </w:rPr>
-              <w:instrText xml:space="preserve"> PAGEREF _Toc234745338 \h </w:instrText>
+              <w:instrText xml:space="preserve"> PAGEREF _Toc234746511 \h </w:instrText>
             </w:r>
             <w:r>
               <w:rPr>
@@ -3023,7 +3023,7 @@
               <w14:ligatures w14:val="standardContextual"/>
             </w:rPr>
           </w:pPr>
-          <w:hyperlink w:anchor="_Toc234745339" w:history="1">
+          <w:hyperlink w:anchor="_Toc234746512" w:history="1">
             <w:r>
               <w:rPr>
                 <w:rStyle w:val="Hyperlink"/>
@@ -3051,7 +3051,7 @@
                 <w:noProof/>
                 <w:webHidden/>
               </w:rPr>
-              <w:instrText xml:space="preserve"> PAGEREF _Toc234745339 \h </w:instrText>
+              <w:instrText xml:space="preserve"> PAGEREF _Toc234746512 \h </w:instrText>
             </w:r>
             <w:r>
               <w:rPr>
@@ -3099,7 +3099,7 @@
               <w14:ligatures w14:val="standardContextual"/>
             </w:rPr>
           </w:pPr>
-          <w:hyperlink w:anchor="_Toc234745340" w:history="1">
+          <w:hyperlink w:anchor="_Toc234746513" w:history="1">
             <w:r>
               <w:rPr>
                 <w:rStyle w:val="Hyperlink"/>
@@ -3127,7 +3127,7 @@
                 <w:noProof/>
                 <w:webHidden/>
               </w:rPr>
-              <w:instrText xml:space="preserve"> PAGEREF _Toc234745340 \h </w:instrText>
+              <w:instrText xml:space="preserve"> PAGEREF _Toc234746513 \h </w:instrText>
             </w:r>
             <w:r>
               <w:rPr>
@@ -3176,7 +3176,7 @@
               <w14:ligatures w14:val="standardContextual"/>
             </w:rPr>
           </w:pPr>
-          <w:hyperlink w:anchor="_Toc234745341" w:history="1">
+          <w:hyperlink w:anchor="_Toc234746514" w:history="1">
             <w:r>
               <w:rPr>
                 <w:rStyle w:val="Hyperlink"/>
@@ -3204,7 +3204,7 @@
                 <w:noProof/>
                 <w:webHidden/>
               </w:rPr>
-              <w:instrText xml:space="preserve"> PAGEREF _Toc234745341 \h </w:instrText>
+              <w:instrText xml:space="preserve"> PAGEREF _Toc234746514 \h </w:instrText>
             </w:r>
             <w:r>
               <w:rPr>
@@ -3253,7 +3253,7 @@
               <w14:ligatures w14:val="standardContextual"/>
             </w:rPr>
           </w:pPr>
-          <w:hyperlink w:anchor="_Toc234745342" w:history="1">
+          <w:hyperlink w:anchor="_Toc234746515" w:history="1">
             <w:r>
               <w:rPr>
                 <w:rStyle w:val="Hyperlink"/>
@@ -3281,7 +3281,7 @@
                 <w:noProof/>
                 <w:webHidden/>
               </w:rPr>
-              <w:instrText xml:space="preserve"> PAGEREF _Toc234745342 \h </w:instrText>
+              <w:instrText xml:space="preserve"> PAGEREF _Toc234746515 \h </w:instrText>
             </w:r>
             <w:r>
               <w:rPr>
@@ -3330,7 +3330,7 @@
               <w14:ligatures w14:val="standardContextual"/>
             </w:rPr>
           </w:pPr>
-          <w:hyperlink w:anchor="_Toc234745343" w:history="1">
+          <w:hyperlink w:anchor="_Toc234746516" w:history="1">
             <w:r>
               <w:rPr>
                 <w:rStyle w:val="Hyperlink"/>
@@ -3358,7 +3358,7 @@
                 <w:noProof/>
                 <w:webHidden/>
               </w:rPr>
-              <w:instrText xml:space="preserve"> PAGEREF _Toc234745343 \h </w:instrText>
+              <w:instrText xml:space="preserve"> PAGEREF _Toc234746516 \h </w:instrText>
             </w:r>
             <w:r>
               <w:rPr>
@@ -3407,7 +3407,7 @@
               <w14:ligatures w14:val="standardContextual"/>
             </w:rPr>
           </w:pPr>
-          <w:hyperlink w:anchor="_Toc234745344" w:history="1">
+          <w:hyperlink w:anchor="_Toc234746517" w:history="1">
             <w:r>
               <w:rPr>
                 <w:rStyle w:val="Hyperlink"/>
@@ -3435,7 +3435,7 @@
                 <w:noProof/>
                 <w:webHidden/>
               </w:rPr>
-              <w:instrText xml:space="preserve"> PAGEREF _Toc234745344 \h </w:instrText>
+              <w:instrText xml:space="preserve"> PAGEREF _Toc234746517 \h </w:instrText>
             </w:r>
             <w:r>
               <w:rPr>
@@ -3484,7 +3484,7 @@
               <w14:ligatures w14:val="standardContextual"/>
             </w:rPr>
           </w:pPr>
-          <w:hyperlink w:anchor="_Toc234745345" w:history="1">
+          <w:hyperlink w:anchor="_Toc234746518" w:history="1">
             <w:r>
               <w:rPr>
                 <w:rStyle w:val="Hyperlink"/>
@@ -3512,7 +3512,7 @@
                 <w:noProof/>
                 <w:webHidden/>
               </w:rPr>
-              <w:instrText xml:space="preserve"> PAGEREF _Toc234745345 \h </w:instrText>
+              <w:instrText xml:space="preserve"> PAGEREF _Toc234746518 \h </w:instrText>
             </w:r>
             <w:r>
               <w:rPr>
@@ -3561,7 +3561,7 @@
               <w14:ligatures w14:val="standardContextual"/>
             </w:rPr>
           </w:pPr>
-          <w:hyperlink w:anchor="_Toc234745346" w:history="1">
+          <w:hyperlink w:anchor="_Toc234746519" w:history="1">
             <w:r>
               <w:rPr>
                 <w:rStyle w:val="Hyperlink"/>
@@ -3589,7 +3589,7 @@
                 <w:noProof/>
                 <w:webHidden/>
               </w:rPr>
-              <w:instrText xml:space="preserve"> PAGEREF _Toc234745346 \h </w:instrText>
+              <w:instrText xml:space="preserve"> PAGEREF _Toc234746519 \h </w:instrText>
             </w:r>
             <w:r>
               <w:rPr>
@@ -3638,7 +3638,7 @@
               <w14:ligatures w14:val="standardContextual"/>
             </w:rPr>
           </w:pPr>
-          <w:hyperlink w:anchor="_Toc234745347" w:history="1">
+          <w:hyperlink w:anchor="_Toc234746520" w:history="1">
             <w:r>
               <w:rPr>
                 <w:rStyle w:val="Hyperlink"/>
@@ -3666,7 +3666,7 @@
                 <w:noProof/>
                 <w:webHidden/>
               </w:rPr>
-              <w:instrText xml:space="preserve"> PAGEREF _Toc234745347 \h </w:instrText>
+              <w:instrText xml:space="preserve"> PAGEREF _Toc234746520 \h </w:instrText>
             </w:r>
             <w:r>
               <w:rPr>
@@ -3714,7 +3714,7 @@
               <w14:ligatures w14:val="standardContextual"/>
             </w:rPr>
           </w:pPr>
-          <w:hyperlink w:anchor="_Toc234745348" w:history="1">
+          <w:hyperlink w:anchor="_Toc234746521" w:history="1">
             <w:r>
               <w:rPr>
                 <w:rStyle w:val="Hyperlink"/>
@@ -3742,7 +3742,7 @@
                 <w:noProof/>
                 <w:webHidden/>
               </w:rPr>
-              <w:instrText xml:space="preserve"> PAGEREF _Toc234745348 \h </w:instrText>
+              <w:instrText xml:space="preserve"> PAGEREF _Toc234746521 \h </w:instrText>
             </w:r>
             <w:r>
               <w:rPr>
@@ -3791,7 +3791,7 @@
               <w14:ligatures w14:val="standardContextual"/>
             </w:rPr>
           </w:pPr>
-          <w:hyperlink w:anchor="_Toc234745349" w:history="1">
+          <w:hyperlink w:anchor="_Toc234746522" w:history="1">
             <w:r>
               <w:rPr>
                 <w:rStyle w:val="Hyperlink"/>
@@ -3819,7 +3819,7 @@
                 <w:noProof/>
                 <w:webHidden/>
               </w:rPr>
-              <w:instrText xml:space="preserve"> PAGEREF _Toc234745349 \h </w:instrText>
+              <w:instrText xml:space="preserve"> PAGEREF _Toc234746522 \h </w:instrText>
             </w:r>
             <w:r>
               <w:rPr>
@@ -3867,7 +3867,7 @@
               <w14:ligatures w14:val="standardContextual"/>
             </w:rPr>
           </w:pPr>
-          <w:hyperlink w:anchor="_Toc234745350" w:history="1">
+          <w:hyperlink w:anchor="_Toc234746523" w:history="1">
             <w:r>
               <w:rPr>
                 <w:rStyle w:val="Hyperlink"/>
@@ -3895,7 +3895,7 @@
                 <w:noProof/>
                 <w:webHidden/>
               </w:rPr>
-              <w:instrText xml:space="preserve"> PAGEREF _Toc234745350 \h </w:instrText>
+              <w:instrText xml:space="preserve"> PAGEREF _Toc234746523 \h </w:instrText>
             </w:r>
             <w:r>
               <w:rPr>
@@ -3944,7 +3944,7 @@
               <w14:ligatures w14:val="standardContextual"/>
             </w:rPr>
           </w:pPr>
-          <w:hyperlink w:anchor="_Toc234745351" w:history="1">
+          <w:hyperlink w:anchor="_Toc234746524" w:history="1">
             <w:r>
               <w:rPr>
                 <w:rStyle w:val="Hyperlink"/>
@@ -3972,7 +3972,7 @@
                 <w:noProof/>
                 <w:webHidden/>
               </w:rPr>
-              <w:instrText xml:space="preserve"> PAGEREF _Toc234745351 \h </w:instrText>
+              <w:instrText xml:space="preserve"> PAGEREF _Toc234746524 \h </w:instrText>
             </w:r>
             <w:r>
               <w:rPr>
@@ -4020,7 +4020,7 @@
               <w14:ligatures w14:val="standardContextual"/>
             </w:rPr>
           </w:pPr>
-          <w:hyperlink w:anchor="_Toc234745352" w:history="1">
+          <w:hyperlink w:anchor="_Toc234746525" w:history="1">
             <w:r>
               <w:rPr>
                 <w:rStyle w:val="Hyperlink"/>
@@ -4048,7 +4048,7 @@
                 <w:noProof/>
                 <w:webHidden/>
               </w:rPr>
-              <w:instrText xml:space="preserve"> PAGEREF _Toc234745352 \h </w:instrText>
+              <w:instrText xml:space="preserve"> PAGEREF _Toc234746525 \h </w:instrText>
             </w:r>
             <w:r>
               <w:rPr>
@@ -4097,7 +4097,7 @@
               <w14:ligatures w14:val="standardContextual"/>
             </w:rPr>
           </w:pPr>
-          <w:hyperlink w:anchor="_Toc234745353" w:history="1">
+          <w:hyperlink w:anchor="_Toc234746526" w:history="1">
             <w:r>
               <w:rPr>
                 <w:rStyle w:val="Hyperlink"/>
@@ -4125,7 +4125,7 @@
                 <w:noProof/>
                 <w:webHidden/>
               </w:rPr>
-              <w:instrText xml:space="preserve"> PAGEREF _Toc234745353 \h </w:instrText>
+              <w:instrText xml:space="preserve"> PAGEREF _Toc234746526 \h </w:instrText>
             </w:r>
             <w:r>
               <w:rPr>
@@ -4174,7 +4174,7 @@
               <w14:ligatures w14:val="standardContextual"/>
             </w:rPr>
           </w:pPr>
-          <w:hyperlink w:anchor="_Toc234745354" w:history="1">
+          <w:hyperlink w:anchor="_Toc234746527" w:history="1">
             <w:r>
               <w:rPr>
                 <w:rStyle w:val="Hyperlink"/>
@@ -4202,7 +4202,7 @@
                 <w:noProof/>
                 <w:webHidden/>
               </w:rPr>
-              <w:instrText xml:space="preserve"> PAGEREF _Toc234745354 \h </w:instrText>
+              <w:instrText xml:space="preserve"> PAGEREF _Toc234746527 \h </w:instrText>
             </w:r>
             <w:r>
               <w:rPr>
@@ -4251,7 +4251,7 @@
               <w14:ligatures w14:val="standardContextual"/>
             </w:rPr>
           </w:pPr>
-          <w:hyperlink w:anchor="_Toc234745355" w:history="1">
+          <w:hyperlink w:anchor="_Toc234746528" w:history="1">
             <w:r>
               <w:rPr>
                 <w:rStyle w:val="Hyperlink"/>
@@ -4279,7 +4279,7 @@
                 <w:noProof/>
                 <w:webHidden/>
               </w:rPr>
-              <w:instrText xml:space="preserve"> PAGEREF _Toc234745355 \h </w:instrText>
+              <w:instrText xml:space="preserve"> PAGEREF _Toc234746528 \h </w:instrText>
             </w:r>
             <w:r>
               <w:rPr>
@@ -4327,7 +4327,7 @@
               <w14:ligatures w14:val="standardContextual"/>
             </w:rPr>
           </w:pPr>
-          <w:hyperlink w:anchor="_Toc234745356" w:history="1">
+          <w:hyperlink w:anchor="_Toc234746529" w:history="1">
             <w:r>
               <w:rPr>
                 <w:rStyle w:val="Hyperlink"/>
@@ -4355,7 +4355,7 @@
                 <w:noProof/>
                 <w:webHidden/>
               </w:rPr>
-              <w:instrText xml:space="preserve"> PAGEREF _Toc234745356 \h </w:instrText>
+              <w:instrText xml:space="preserve"> PAGEREF _Toc234746529 \h </w:instrText>
             </w:r>
             <w:r>
               <w:rPr>
@@ -4404,7 +4404,7 @@
               <w14:ligatures w14:val="standardContextual"/>
             </w:rPr>
           </w:pPr>
-          <w:hyperlink w:anchor="_Toc234745357" w:history="1">
+          <w:hyperlink w:anchor="_Toc234746530" w:history="1">
             <w:r>
               <w:rPr>
                 <w:rStyle w:val="Hyperlink"/>
@@ -4432,7 +4432,7 @@
                 <w:noProof/>
                 <w:webHidden/>
               </w:rPr>
-              <w:instrText xml:space="preserve"> PAGEREF _Toc234745357 \h </w:instrText>
+              <w:instrText xml:space="preserve"> PAGEREF _Toc234746530 \h </w:instrText>
             </w:r>
             <w:r>
               <w:rPr>
@@ -4481,7 +4481,7 @@
               <w14:ligatures w14:val="standardContextual"/>
             </w:rPr>
           </w:pPr>
-          <w:hyperlink w:anchor="_Toc234745358" w:history="1">
+          <w:hyperlink w:anchor="_Toc234746531" w:history="1">
             <w:r>
               <w:rPr>
                 <w:rStyle w:val="Hyperlink"/>
@@ -4509,7 +4509,7 @@
                 <w:noProof/>
                 <w:webHidden/>
               </w:rPr>
-              <w:instrText xml:space="preserve"> PAGEREF _Toc234745358 \h </w:instrText>
+              <w:instrText xml:space="preserve"> PAGEREF _Toc234746531 \h </w:instrText>
             </w:r>
             <w:r>
               <w:rPr>
@@ -4558,7 +4558,7 @@
               <w14:ligatures w14:val="standardContextual"/>
             </w:rPr>
           </w:pPr>
-          <w:hyperlink w:anchor="_Toc234745359" w:history="1">
+          <w:hyperlink w:anchor="_Toc234746532" w:history="1">
             <w:r>
               <w:rPr>
                 <w:rStyle w:val="Hyperlink"/>
@@ -4586,7 +4586,7 @@
                 <w:noProof/>
                 <w:webHidden/>
               </w:rPr>
-              <w:instrText xml:space="preserve"> PAGEREF _Toc234745359 \h </w:instrText>
+              <w:instrText xml:space="preserve"> PAGEREF _Toc234746532 \h </w:instrText>
             </w:r>
             <w:r>
               <w:rPr>
@@ -4635,7 +4635,7 @@
               <w14:ligatures w14:val="standardContextual"/>
             </w:rPr>
           </w:pPr>
-          <w:hyperlink w:anchor="_Toc234745360" w:history="1">
+          <w:hyperlink w:anchor="_Toc234746533" w:history="1">
             <w:r>
               <w:rPr>
                 <w:rStyle w:val="Hyperlink"/>
@@ -4663,7 +4663,7 @@
                 <w:noProof/>
                 <w:webHidden/>
               </w:rPr>
-              <w:instrText xml:space="preserve"> PAGEREF _Toc234745360 \h </w:instrText>
+              <w:instrText xml:space="preserve"> PAGEREF _Toc234746533 \h </w:instrText>
             </w:r>
             <w:r>
               <w:rPr>
@@ -4712,7 +4712,7 @@
               <w14:ligatures w14:val="standardContextual"/>
             </w:rPr>
           </w:pPr>
-          <w:hyperlink w:anchor="_Toc234745361" w:history="1">
+          <w:hyperlink w:anchor="_Toc234746534" w:history="1">
             <w:r>
               <w:rPr>
                 <w:rStyle w:val="Hyperlink"/>
@@ -4740,7 +4740,7 @@
                 <w:noProof/>
                 <w:webHidden/>
               </w:rPr>
-              <w:instrText xml:space="preserve"> PAGEREF _Toc234745361 \h </w:instrText>
+              <w:instrText xml:space="preserve"> PAGEREF _Toc234746534 \h </w:instrText>
             </w:r>
             <w:r>
               <w:rPr>
@@ -4788,7 +4788,7 @@
               <w14:ligatures w14:val="standardContextual"/>
             </w:rPr>
           </w:pPr>
-          <w:hyperlink w:anchor="_Toc234745362" w:history="1">
+          <w:hyperlink w:anchor="_Toc234746535" w:history="1">
             <w:r>
               <w:rPr>
                 <w:rStyle w:val="Hyperlink"/>
@@ -4816,7 +4816,7 @@
                 <w:noProof/>
                 <w:webHidden/>
               </w:rPr>
-              <w:instrText xml:space="preserve"> PAGEREF _Toc234745362 \h </w:instrText>
+              <w:instrText xml:space="preserve"> PAGEREF _Toc234746535 \h </w:instrText>
             </w:r>
             <w:r>
               <w:rPr>
@@ -4866,7 +4866,7 @@
               <w14:ligatures w14:val="standardContextual"/>
             </w:rPr>
           </w:pPr>
-          <w:hyperlink w:anchor="_Toc234745363" w:history="1">
+          <w:hyperlink w:anchor="_Toc234746536" w:history="1">
             <w:r>
               <w:rPr>
                 <w:rStyle w:val="Hyperlink"/>
@@ -4894,7 +4894,7 @@
                 <w:noProof/>
                 <w:webHidden/>
               </w:rPr>
-              <w:instrText xml:space="preserve"> PAGEREF _Toc234745363 \h </w:instrText>
+              <w:instrText xml:space="preserve"> PAGEREF _Toc234746536 \h </w:instrText>
             </w:r>
             <w:r>
               <w:rPr>
@@ -4942,7 +4942,7 @@
               <w14:ligatures w14:val="standardContextual"/>
             </w:rPr>
           </w:pPr>
-          <w:hyperlink w:anchor="_Toc234745364" w:history="1">
+          <w:hyperlink w:anchor="_Toc234746537" w:history="1">
             <w:r>
               <w:rPr>
                 <w:rStyle w:val="Hyperlink"/>
@@ -4970,7 +4970,7 @@
                 <w:noProof/>
                 <w:webHidden/>
               </w:rPr>
-              <w:instrText xml:space="preserve"> PAGEREF _Toc234745364 \h </w:instrText>
+              <w:instrText xml:space="preserve"> PAGEREF _Toc234746537 \h </w:instrText>
             </w:r>
             <w:r>
               <w:rPr>
@@ -5018,7 +5018,7 @@
               <w14:ligatures w14:val="standardContextual"/>
             </w:rPr>
           </w:pPr>
-          <w:hyperlink w:anchor="_Toc234745365" w:history="1">
+          <w:hyperlink w:anchor="_Toc234746538" w:history="1">
             <w:r>
               <w:rPr>
                 <w:rStyle w:val="Hyperlink"/>
@@ -5046,7 +5046,7 @@
                 <w:noProof/>
                 <w:webHidden/>
               </w:rPr>
-              <w:instrText xml:space="preserve"> PAGEREF _Toc234745365 \h </w:instrText>
+              <w:instrText xml:space="preserve"> PAGEREF _Toc234746538 \h </w:instrText>
             </w:r>
             <w:r>
               <w:rPr>
@@ -5094,7 +5094,7 @@
               <w14:ligatures w14:val="standardContextual"/>
             </w:rPr>
           </w:pPr>
-          <w:hyperlink w:anchor="_Toc234745366" w:history="1">
+          <w:hyperlink w:anchor="_Toc234746539" w:history="1">
             <w:r>
               <w:rPr>
                 <w:rStyle w:val="Hyperlink"/>
@@ -5122,7 +5122,7 @@
                 <w:noProof/>
                 <w:webHidden/>
               </w:rPr>
-              <w:instrText xml:space="preserve"> PAGEREF _Toc234745366 \h </w:instrText>
+              <w:instrText xml:space="preserve"> PAGEREF _Toc234746539 \h </w:instrText>
             </w:r>
             <w:r>
               <w:rPr>
@@ -5172,7 +5172,7 @@
               <w14:ligatures w14:val="standardContextual"/>
             </w:rPr>
           </w:pPr>
-          <w:hyperlink w:anchor="_Toc234745367" w:history="1">
+          <w:hyperlink w:anchor="_Toc234746540" w:history="1">
             <w:r>
               <w:rPr>
                 <w:rStyle w:val="Hyperlink"/>
@@ -5199,7 +5199,7 @@
                 <w:noProof/>
                 <w:webHidden/>
               </w:rPr>
-              <w:instrText xml:space="preserve"> PAGEREF _Toc234745367 \h </w:instrText>
+              <w:instrText xml:space="preserve"> PAGEREF _Toc234746540 \h </w:instrText>
             </w:r>
             <w:r>
               <w:rPr>
@@ -5249,7 +5249,7 @@
               <w14:ligatures w14:val="standardContextual"/>
             </w:rPr>
           </w:pPr>
-          <w:hyperlink w:anchor="_Toc234745368" w:history="1">
+          <w:hyperlink w:anchor="_Toc234746541" w:history="1">
             <w:r>
               <w:rPr>
                 <w:rStyle w:val="Hyperlink"/>
@@ -5276,7 +5276,7 @@
                 <w:noProof/>
                 <w:webHidden/>
               </w:rPr>
-              <w:instrText xml:space="preserve"> PAGEREF _Toc234745368 \h </w:instrText>
+              <w:instrText xml:space="preserve"> PAGEREF _Toc234746541 \h </w:instrText>
             </w:r>
             <w:r>
               <w:rPr>
@@ -5439,7 +5439,7 @@
       <w:r>
         <w:fldChar w:fldCharType="separate"/>
       </w:r>
-      <w:hyperlink w:anchor="_Toc234745369" w:history="1">
+      <w:hyperlink w:anchor="_Toc234746542" w:history="1">
         <w:r>
           <w:rPr>
             <w:rStyle w:val="Hyperlink"/>
@@ -5475,7 +5475,7 @@
             <w:noProof/>
             <w:webHidden/>
           </w:rPr>
-          <w:instrText xml:space="preserve"> PAGEREF _Toc234745369 \h </w:instrText>
+          <w:instrText xml:space="preserve"> PAGEREF _Toc234746542 \h </w:instrText>
         </w:r>
         <w:r>
           <w:rPr>
@@ -5522,7 +5522,7 @@
           <w14:ligatures w14:val="standardContextual"/>
         </w:rPr>
       </w:pPr>
-      <w:hyperlink w:anchor="_Toc234745370" w:history="1">
+      <w:hyperlink w:anchor="_Toc234746543" w:history="1">
         <w:r>
           <w:rPr>
             <w:rStyle w:val="Hyperlink"/>
@@ -5558,7 +5558,7 @@
             <w:noProof/>
             <w:webHidden/>
           </w:rPr>
-          <w:instrText xml:space="preserve"> PAGEREF _Toc234745370 \h </w:instrText>
+          <w:instrText xml:space="preserve"> PAGEREF _Toc234746543 \h </w:instrText>
         </w:r>
         <w:r>
           <w:rPr>
@@ -5605,7 +5605,7 @@
           <w14:ligatures w14:val="standardContextual"/>
         </w:rPr>
       </w:pPr>
-      <w:hyperlink w:anchor="_Toc234745371" w:history="1">
+      <w:hyperlink w:anchor="_Toc234746544" w:history="1">
         <w:r>
           <w:rPr>
             <w:rStyle w:val="Hyperlink"/>
@@ -5641,7 +5641,7 @@
             <w:noProof/>
             <w:webHidden/>
           </w:rPr>
-          <w:instrText xml:space="preserve"> PAGEREF _Toc234745371 \h </w:instrText>
+          <w:instrText xml:space="preserve"> PAGEREF _Toc234746544 \h </w:instrText>
         </w:r>
         <w:r>
           <w:rPr>
@@ -5688,7 +5688,7 @@
           <w14:ligatures w14:val="standardContextual"/>
         </w:rPr>
       </w:pPr>
-      <w:hyperlink w:anchor="_Toc234745372" w:history="1">
+      <w:hyperlink w:anchor="_Toc234746545" w:history="1">
         <w:r>
           <w:rPr>
             <w:rStyle w:val="Hyperlink"/>
@@ -5724,7 +5724,7 @@
             <w:noProof/>
             <w:webHidden/>
           </w:rPr>
-          <w:instrText xml:space="preserve"> PAGEREF _Toc234745372 \h </w:instrText>
+          <w:instrText xml:space="preserve"> PAGEREF _Toc234746545 \h </w:instrText>
         </w:r>
         <w:r>
           <w:rPr>
@@ -5771,7 +5771,7 @@
           <w14:ligatures w14:val="standardContextual"/>
         </w:rPr>
       </w:pPr>
-      <w:hyperlink w:anchor="_Toc234745373" w:history="1">
+      <w:hyperlink w:anchor="_Toc234746546" w:history="1">
         <w:r>
           <w:rPr>
             <w:rStyle w:val="Hyperlink"/>
@@ -5807,7 +5807,7 @@
             <w:noProof/>
             <w:webHidden/>
           </w:rPr>
-          <w:instrText xml:space="preserve"> PAGEREF _Toc234745373 \h </w:instrText>
+          <w:instrText xml:space="preserve"> PAGEREF _Toc234746546 \h </w:instrText>
         </w:r>
         <w:r>
           <w:rPr>
@@ -5854,7 +5854,7 @@
           <w14:ligatures w14:val="standardContextual"/>
         </w:rPr>
       </w:pPr>
-      <w:hyperlink w:anchor="_Toc234745374" w:history="1">
+      <w:hyperlink w:anchor="_Toc234746547" w:history="1">
         <w:r>
           <w:rPr>
             <w:rStyle w:val="Hyperlink"/>
@@ -5890,7 +5890,7 @@
             <w:noProof/>
             <w:webHidden/>
           </w:rPr>
-          <w:instrText xml:space="preserve"> PAGEREF _Toc234745374 \h </w:instrText>
+          <w:instrText xml:space="preserve"> PAGEREF _Toc234746547 \h </w:instrText>
         </w:r>
         <w:r>
           <w:rPr>
@@ -5937,7 +5937,7 @@
           <w14:ligatures w14:val="standardContextual"/>
         </w:rPr>
       </w:pPr>
-      <w:hyperlink w:anchor="_Toc234745375" w:history="1">
+      <w:hyperlink w:anchor="_Toc234746548" w:history="1">
         <w:r>
           <w:rPr>
             <w:rStyle w:val="Hyperlink"/>
@@ -5973,7 +5973,7 @@
             <w:noProof/>
             <w:webHidden/>
           </w:rPr>
-          <w:instrText xml:space="preserve"> PAGEREF _Toc234745375 \h </w:instrText>
+          <w:instrText xml:space="preserve"> PAGEREF _Toc234746548 \h </w:instrText>
         </w:r>
         <w:r>
           <w:rPr>
@@ -6020,7 +6020,7 @@
           <w14:ligatures w14:val="standardContextual"/>
         </w:rPr>
       </w:pPr>
-      <w:hyperlink w:anchor="_Toc234745376" w:history="1">
+      <w:hyperlink w:anchor="_Toc234746549" w:history="1">
         <w:r>
           <w:rPr>
             <w:rStyle w:val="Hyperlink"/>
@@ -6056,7 +6056,7 @@
             <w:noProof/>
             <w:webHidden/>
           </w:rPr>
-          <w:instrText xml:space="preserve"> PAGEREF _Toc234745376 \h </w:instrText>
+          <w:instrText xml:space="preserve"> PAGEREF _Toc234746549 \h </w:instrText>
         </w:r>
         <w:r>
           <w:rPr>
@@ -6104,7 +6104,7 @@
           <w14:ligatures w14:val="standardContextual"/>
         </w:rPr>
       </w:pPr>
-      <w:hyperlink w:anchor="_Toc234745377" w:history="1">
+      <w:hyperlink w:anchor="_Toc234746550" w:history="1">
         <w:r>
           <w:rPr>
             <w:rStyle w:val="Hyperlink"/>
@@ -6152,7 +6152,7 @@
             <w:noProof/>
             <w:webHidden/>
           </w:rPr>
-          <w:instrText xml:space="preserve"> PAGEREF _Toc234745377 \h </w:instrText>
+          <w:instrText xml:space="preserve"> PAGEREF _Toc234746550 \h </w:instrText>
         </w:r>
         <w:r>
           <w:rPr>
@@ -6200,7 +6200,7 @@
           <w14:ligatures w14:val="standardContextual"/>
         </w:rPr>
       </w:pPr>
-      <w:hyperlink w:anchor="_Toc234745378" w:history="1">
+      <w:hyperlink w:anchor="_Toc234746551" w:history="1">
         <w:r>
           <w:rPr>
             <w:rStyle w:val="Hyperlink"/>
@@ -6248,7 +6248,7 @@
             <w:noProof/>
             <w:webHidden/>
           </w:rPr>
-          <w:instrText xml:space="preserve"> PAGEREF _Toc234745378 \h </w:instrText>
+          <w:instrText xml:space="preserve"> PAGEREF _Toc234746551 \h </w:instrText>
         </w:r>
         <w:r>
           <w:rPr>
@@ -6295,7 +6295,7 @@
           <w14:ligatures w14:val="standardContextual"/>
         </w:rPr>
       </w:pPr>
-      <w:hyperlink w:anchor="_Toc234745379" w:history="1">
+      <w:hyperlink w:anchor="_Toc234746552" w:history="1">
         <w:r>
           <w:rPr>
             <w:rStyle w:val="Hyperlink"/>
@@ -6331,7 +6331,7 @@
             <w:noProof/>
             <w:webHidden/>
           </w:rPr>
-          <w:instrText xml:space="preserve"> PAGEREF _Toc234745379 \h </w:instrText>
+          <w:instrText xml:space="preserve"> PAGEREF _Toc234746552 \h </w:instrText>
         </w:r>
         <w:r>
           <w:rPr>
@@ -6520,7 +6520,7 @@
       <w:r>
         <w:fldChar w:fldCharType="separate"/>
       </w:r>
-      <w:hyperlink w:anchor="_Toc234745380" w:history="1">
+      <w:hyperlink w:anchor="_Toc234746553" w:history="1">
         <w:r>
           <w:rPr>
             <w:rStyle w:val="Hyperlink"/>
@@ -6556,7 +6556,7 @@
             <w:noProof/>
             <w:webHidden/>
           </w:rPr>
-          <w:instrText xml:space="preserve"> PAGEREF _Toc234745380 \h </w:instrText>
+          <w:instrText xml:space="preserve"> PAGEREF _Toc234746553 \h </w:instrText>
         </w:r>
         <w:r>
           <w:rPr>
@@ -6604,7 +6604,7 @@
           <w14:ligatures w14:val="standardContextual"/>
         </w:rPr>
       </w:pPr>
-      <w:hyperlink w:anchor="_Toc234745381" w:history="1">
+      <w:hyperlink w:anchor="_Toc234746554" w:history="1">
         <w:r>
           <w:rPr>
             <w:rStyle w:val="Hyperlink"/>
@@ -6652,7 +6652,7 @@
             <w:noProof/>
             <w:webHidden/>
           </w:rPr>
-          <w:instrText xml:space="preserve"> PAGEREF _Toc234745381 \h </w:instrText>
+          <w:instrText xml:space="preserve"> PAGEREF _Toc234746554 \h </w:instrText>
         </w:r>
         <w:r>
           <w:rPr>
@@ -6699,7 +6699,7 @@
           <w14:ligatures w14:val="standardContextual"/>
         </w:rPr>
       </w:pPr>
-      <w:hyperlink w:anchor="_Toc234745382" w:history="1">
+      <w:hyperlink w:anchor="_Toc234746555" w:history="1">
         <w:r>
           <w:rPr>
             <w:rStyle w:val="Hyperlink"/>
@@ -6735,7 +6735,7 @@
             <w:noProof/>
             <w:webHidden/>
           </w:rPr>
-          <w:instrText xml:space="preserve"> PAGEREF _Toc234745382 \h </w:instrText>
+          <w:instrText xml:space="preserve"> PAGEREF _Toc234746555 \h </w:instrText>
         </w:r>
         <w:r>
           <w:rPr>
@@ -6782,7 +6782,7 @@
           <w14:ligatures w14:val="standardContextual"/>
         </w:rPr>
       </w:pPr>
-      <w:hyperlink w:anchor="_Toc234745383" w:history="1">
+      <w:hyperlink w:anchor="_Toc234746556" w:history="1">
         <w:r>
           <w:rPr>
             <w:rStyle w:val="Hyperlink"/>
@@ -6818,7 +6818,7 @@
             <w:noProof/>
             <w:webHidden/>
           </w:rPr>
-          <w:instrText xml:space="preserve"> PAGEREF _Toc234745383 \h </w:instrText>
+          <w:instrText xml:space="preserve"> PAGEREF _Toc234746556 \h </w:instrText>
         </w:r>
         <w:r>
           <w:rPr>
@@ -6865,7 +6865,7 @@
           <w14:ligatures w14:val="standardContextual"/>
         </w:rPr>
       </w:pPr>
-      <w:hyperlink w:anchor="_Toc234745384" w:history="1">
+      <w:hyperlink w:anchor="_Toc234746557" w:history="1">
         <w:r>
           <w:rPr>
             <w:rStyle w:val="Hyperlink"/>
@@ -6901,7 +6901,7 @@
             <w:noProof/>
             <w:webHidden/>
           </w:rPr>
-          <w:instrText xml:space="preserve"> PAGEREF _Toc234745384 \h </w:instrText>
+          <w:instrText xml:space="preserve"> PAGEREF _Toc234746557 \h </w:instrText>
         </w:r>
         <w:r>
           <w:rPr>
@@ -6948,7 +6948,7 @@
           <w14:ligatures w14:val="standardContextual"/>
         </w:rPr>
       </w:pPr>
-      <w:hyperlink w:anchor="_Toc234745385" w:history="1">
+      <w:hyperlink w:anchor="_Toc234746558" w:history="1">
         <w:r>
           <w:rPr>
             <w:rStyle w:val="Hyperlink"/>
@@ -6984,7 +6984,7 @@
             <w:noProof/>
             <w:webHidden/>
           </w:rPr>
-          <w:instrText xml:space="preserve"> PAGEREF _Toc234745385 \h </w:instrText>
+          <w:instrText xml:space="preserve"> PAGEREF _Toc234746558 \h </w:instrText>
         </w:r>
         <w:r>
           <w:rPr>
@@ -7031,7 +7031,7 @@
           <w14:ligatures w14:val="standardContextual"/>
         </w:rPr>
       </w:pPr>
-      <w:hyperlink w:anchor="_Toc234745386" w:history="1">
+      <w:hyperlink w:anchor="_Toc234746559" w:history="1">
         <w:r>
           <w:rPr>
             <w:rStyle w:val="Hyperlink"/>
@@ -7067,7 +7067,7 @@
             <w:noProof/>
             <w:webHidden/>
           </w:rPr>
-          <w:instrText xml:space="preserve"> PAGEREF _Toc234745386 \h </w:instrText>
+          <w:instrText xml:space="preserve"> PAGEREF _Toc234746559 \h </w:instrText>
         </w:r>
         <w:r>
           <w:rPr>
@@ -7114,7 +7114,7 @@
           <w14:ligatures w14:val="standardContextual"/>
         </w:rPr>
       </w:pPr>
-      <w:hyperlink w:anchor="_Toc234745387" w:history="1">
+      <w:hyperlink w:anchor="_Toc234746560" w:history="1">
         <w:r>
           <w:rPr>
             <w:rStyle w:val="Hyperlink"/>
@@ -7150,7 +7150,7 @@
             <w:noProof/>
             <w:webHidden/>
           </w:rPr>
-          <w:instrText xml:space="preserve"> PAGEREF _Toc234745387 \h </w:instrText>
+          <w:instrText xml:space="preserve"> PAGEREF _Toc234746560 \h </w:instrText>
         </w:r>
         <w:r>
           <w:rPr>
@@ -7198,7 +7198,7 @@
           <w14:ligatures w14:val="standardContextual"/>
         </w:rPr>
       </w:pPr>
-      <w:hyperlink w:anchor="_Toc234745388" w:history="1">
+      <w:hyperlink w:anchor="_Toc234746561" w:history="1">
         <w:r>
           <w:rPr>
             <w:rStyle w:val="Hyperlink"/>
@@ -7246,7 +7246,7 @@
             <w:noProof/>
             <w:webHidden/>
           </w:rPr>
-          <w:instrText xml:space="preserve"> PAGEREF _Toc234745388 \h </w:instrText>
+          <w:instrText xml:space="preserve"> PAGEREF _Toc234746561 \h </w:instrText>
         </w:r>
         <w:r>
           <w:rPr>
@@ -7293,7 +7293,7 @@
           <w14:ligatures w14:val="standardContextual"/>
         </w:rPr>
       </w:pPr>
-      <w:hyperlink w:anchor="_Toc234745389" w:history="1">
+      <w:hyperlink w:anchor="_Toc234746562" w:history="1">
         <w:r>
           <w:rPr>
             <w:rStyle w:val="Hyperlink"/>
@@ -7329,7 +7329,7 @@
             <w:noProof/>
             <w:webHidden/>
           </w:rPr>
-          <w:instrText xml:space="preserve"> PAGEREF _Toc234745389 \h </w:instrText>
+          <w:instrText xml:space="preserve"> PAGEREF _Toc234746562 \h </w:instrText>
         </w:r>
         <w:r>
           <w:rPr>
@@ -7376,7 +7376,7 @@
           <w14:ligatures w14:val="standardContextual"/>
         </w:rPr>
       </w:pPr>
-      <w:hyperlink w:anchor="_Toc234745390" w:history="1">
+      <w:hyperlink w:anchor="_Toc234746563" w:history="1">
         <w:r>
           <w:rPr>
             <w:rStyle w:val="Hyperlink"/>
@@ -7412,7 +7412,7 @@
             <w:noProof/>
             <w:webHidden/>
           </w:rPr>
-          <w:instrText xml:space="preserve"> PAGEREF _Toc234745390 \h </w:instrText>
+          <w:instrText xml:space="preserve"> PAGEREF _Toc234746563 \h </w:instrText>
         </w:r>
         <w:r>
           <w:rPr>
@@ -7459,7 +7459,7 @@
           <w14:ligatures w14:val="standardContextual"/>
         </w:rPr>
       </w:pPr>
-      <w:hyperlink w:anchor="_Toc234745391" w:history="1">
+      <w:hyperlink w:anchor="_Toc234746564" w:history="1">
         <w:r>
           <w:rPr>
             <w:rStyle w:val="Hyperlink"/>
@@ -7495,7 +7495,7 @@
             <w:noProof/>
             <w:webHidden/>
           </w:rPr>
-          <w:instrText xml:space="preserve"> PAGEREF _Toc234745391 \h </w:instrText>
+          <w:instrText xml:space="preserve"> PAGEREF _Toc234746564 \h </w:instrText>
         </w:r>
         <w:r>
           <w:rPr>
@@ -7624,8 +7624,8 @@
       </w:pPr>
       <w:bookmarkStart w:id="0" w:name="_Toc230952642"/>
       <w:bookmarkStart w:id="1" w:name="_Toc234686846"/>
-      <w:bookmarkStart w:id="2" w:name="_Toc234745298"/>
-      <w:bookmarkStart w:id="3" w:name="_Toc234745380"/>
+      <w:bookmarkStart w:id="2" w:name="_Toc234746471"/>
+      <w:bookmarkStart w:id="3" w:name="_Toc234746553"/>
       <w:r>
         <w:t xml:space="preserve">Tabla </w:t>
       </w:r>
@@ -8025,8 +8025,8 @@
       </w:pPr>
       <w:bookmarkStart w:id="4" w:name="_Toc230950243"/>
       <w:bookmarkStart w:id="5" w:name="_Toc234686783"/>
-      <w:bookmarkStart w:id="6" w:name="_Toc234745228"/>
-      <w:bookmarkStart w:id="7" w:name="_Toc234745310"/>
+      <w:bookmarkStart w:id="6" w:name="_Toc234746401"/>
+      <w:bookmarkStart w:id="7" w:name="_Toc234746483"/>
       <w:r>
         <w:lastRenderedPageBreak/>
         <w:t>1. Introducción</w:t>
@@ -8046,8 +8046,8 @@
       </w:pPr>
       <w:bookmarkStart w:id="8" w:name="_Toc230950244"/>
       <w:bookmarkStart w:id="9" w:name="_Toc234686784"/>
-      <w:bookmarkStart w:id="10" w:name="_Toc234745229"/>
-      <w:bookmarkStart w:id="11" w:name="_Toc234745311"/>
+      <w:bookmarkStart w:id="10" w:name="_Toc234746402"/>
+      <w:bookmarkStart w:id="11" w:name="_Toc234746484"/>
       <w:r>
         <w:t>1.1. Motivación</w:t>
       </w:r>
@@ -8162,8 +8162,8 @@
       <w:bookmarkStart w:id="12" w:name="_Toc230952994"/>
       <w:bookmarkStart w:id="13" w:name="_Toc230961083"/>
       <w:bookmarkStart w:id="14" w:name="_Toc234686835"/>
-      <w:bookmarkStart w:id="15" w:name="_Toc234745287"/>
-      <w:bookmarkStart w:id="16" w:name="_Toc234745369"/>
+      <w:bookmarkStart w:id="15" w:name="_Toc234746460"/>
+      <w:bookmarkStart w:id="16" w:name="_Toc234746542"/>
       <w:r>
         <w:t xml:space="preserve">Figura </w:t>
       </w:r>
@@ -8225,8 +8225,8 @@
       </w:pPr>
       <w:bookmarkStart w:id="17" w:name="_Toc230950245"/>
       <w:bookmarkStart w:id="18" w:name="_Toc234686785"/>
-      <w:bookmarkStart w:id="19" w:name="_Toc234745230"/>
-      <w:bookmarkStart w:id="20" w:name="_Toc234745312"/>
+      <w:bookmarkStart w:id="19" w:name="_Toc234746403"/>
+      <w:bookmarkStart w:id="20" w:name="_Toc234746485"/>
       <w:r>
         <w:t>1.2. Planteamiento del trabajo</w:t>
       </w:r>
@@ -8326,7 +8326,7 @@
                     <pic:cNvPicPr/>
                   </pic:nvPicPr>
                   <pic:blipFill>
-                    <a:blip r:embed="rId12"/>
+                    <a:blip r:embed="rId13"/>
                     <a:stretch>
                       <a:fillRect/>
                     </a:stretch>
@@ -8355,8 +8355,8 @@
       <w:bookmarkStart w:id="21" w:name="_Toc230952995"/>
       <w:bookmarkStart w:id="22" w:name="_Toc230961084"/>
       <w:bookmarkStart w:id="23" w:name="_Toc234686836"/>
-      <w:bookmarkStart w:id="24" w:name="_Toc234745288"/>
-      <w:bookmarkStart w:id="25" w:name="_Toc234745370"/>
+      <w:bookmarkStart w:id="24" w:name="_Toc234746461"/>
+      <w:bookmarkStart w:id="25" w:name="_Toc234746543"/>
       <w:r>
         <w:t xml:space="preserve">Figura </w:t>
       </w:r>
@@ -8418,8 +8418,8 @@
       </w:pPr>
       <w:bookmarkStart w:id="26" w:name="_Toc230950246"/>
       <w:bookmarkStart w:id="27" w:name="_Toc234686786"/>
-      <w:bookmarkStart w:id="28" w:name="_Toc234745231"/>
-      <w:bookmarkStart w:id="29" w:name="_Toc234745313"/>
+      <w:bookmarkStart w:id="28" w:name="_Toc234746404"/>
+      <w:bookmarkStart w:id="29" w:name="_Toc234746486"/>
       <w:r>
         <w:t>1.3. Estructura del trabajo</w:t>
       </w:r>
@@ -8460,8 +8460,8 @@
       </w:pPr>
       <w:bookmarkStart w:id="30" w:name="_Toc230950247"/>
       <w:bookmarkStart w:id="31" w:name="_Toc234686787"/>
-      <w:bookmarkStart w:id="32" w:name="_Toc234745232"/>
-      <w:bookmarkStart w:id="33" w:name="_Toc234745314"/>
+      <w:bookmarkStart w:id="32" w:name="_Toc234746405"/>
+      <w:bookmarkStart w:id="33" w:name="_Toc234746487"/>
       <w:r>
         <w:lastRenderedPageBreak/>
         <w:t>2. Contexto y estado del arte</w:t>
@@ -8481,8 +8481,8 @@
       </w:pPr>
       <w:bookmarkStart w:id="34" w:name="_Toc230950248"/>
       <w:bookmarkStart w:id="35" w:name="_Toc234686788"/>
-      <w:bookmarkStart w:id="36" w:name="_Toc234745233"/>
-      <w:bookmarkStart w:id="37" w:name="_Toc234745315"/>
+      <w:bookmarkStart w:id="36" w:name="_Toc234746406"/>
+      <w:bookmarkStart w:id="37" w:name="_Toc234746488"/>
       <w:r>
         <w:t>2.1. Contexto del problema</w:t>
       </w:r>
@@ -8505,8 +8505,8 @@
       </w:pPr>
       <w:bookmarkStart w:id="38" w:name="_Toc230950249"/>
       <w:bookmarkStart w:id="39" w:name="_Toc234686789"/>
-      <w:bookmarkStart w:id="40" w:name="_Toc234745234"/>
-      <w:bookmarkStart w:id="41" w:name="_Toc234745316"/>
+      <w:bookmarkStart w:id="40" w:name="_Toc234746407"/>
+      <w:bookmarkStart w:id="41" w:name="_Toc234746489"/>
       <w:r>
         <w:rPr>
           <w:b w:val="0"/>
@@ -8654,7 +8654,7 @@
                     <pic:cNvPicPr/>
                   </pic:nvPicPr>
                   <pic:blipFill>
-                    <a:blip r:embed="rId12"/>
+                    <a:blip r:embed="rId14"/>
                     <a:stretch>
                       <a:fillRect/>
                     </a:stretch>
@@ -8683,8 +8683,8 @@
       <w:bookmarkStart w:id="42" w:name="_Toc230952996"/>
       <w:bookmarkStart w:id="43" w:name="_Toc230961085"/>
       <w:bookmarkStart w:id="44" w:name="_Toc234686837"/>
-      <w:bookmarkStart w:id="45" w:name="_Toc234745289"/>
-      <w:bookmarkStart w:id="46" w:name="_Toc234745371"/>
+      <w:bookmarkStart w:id="45" w:name="_Toc234746462"/>
+      <w:bookmarkStart w:id="46" w:name="_Toc234746544"/>
       <w:r>
         <w:t xml:space="preserve">Figura </w:t>
       </w:r>
@@ -8758,8 +8758,8 @@
       </w:pPr>
       <w:bookmarkStart w:id="47" w:name="_Toc230950250"/>
       <w:bookmarkStart w:id="48" w:name="_Toc234686790"/>
-      <w:bookmarkStart w:id="49" w:name="_Toc234745235"/>
-      <w:bookmarkStart w:id="50" w:name="_Toc234745317"/>
+      <w:bookmarkStart w:id="49" w:name="_Toc234746408"/>
+      <w:bookmarkStart w:id="50" w:name="_Toc234746490"/>
       <w:r>
         <w:rPr>
           <w:b w:val="0"/>
@@ -8834,8 +8834,8 @@
       </w:pPr>
       <w:bookmarkStart w:id="51" w:name="_Toc230950251"/>
       <w:bookmarkStart w:id="52" w:name="_Toc234686791"/>
-      <w:bookmarkStart w:id="53" w:name="_Toc234745236"/>
-      <w:bookmarkStart w:id="54" w:name="_Toc234745318"/>
+      <w:bookmarkStart w:id="53" w:name="_Toc234746409"/>
+      <w:bookmarkStart w:id="54" w:name="_Toc234746491"/>
       <w:r>
         <w:rPr>
           <w:b w:val="0"/>
@@ -8935,8 +8935,8 @@
       </w:pPr>
       <w:bookmarkStart w:id="55" w:name="_Toc230950252"/>
       <w:bookmarkStart w:id="56" w:name="_Toc234686792"/>
-      <w:bookmarkStart w:id="57" w:name="_Toc234745237"/>
-      <w:bookmarkStart w:id="58" w:name="_Toc234745319"/>
+      <w:bookmarkStart w:id="57" w:name="_Toc234746410"/>
+      <w:bookmarkStart w:id="58" w:name="_Toc234746492"/>
       <w:r>
         <w:rPr>
           <w:b w:val="0"/>
@@ -9038,8 +9038,8 @@
       </w:pPr>
       <w:bookmarkStart w:id="59" w:name="_Toc230950253"/>
       <w:bookmarkStart w:id="60" w:name="_Toc234686793"/>
-      <w:bookmarkStart w:id="61" w:name="_Toc234745238"/>
-      <w:bookmarkStart w:id="62" w:name="_Toc234745320"/>
+      <w:bookmarkStart w:id="61" w:name="_Toc234746411"/>
+      <w:bookmarkStart w:id="62" w:name="_Toc234746493"/>
       <w:r>
         <w:lastRenderedPageBreak/>
         <w:t>2.2. Estado del arte</w:t>
@@ -9063,8 +9063,8 @@
       </w:pPr>
       <w:bookmarkStart w:id="63" w:name="_Toc230950254"/>
       <w:bookmarkStart w:id="64" w:name="_Toc234686794"/>
-      <w:bookmarkStart w:id="65" w:name="_Toc234745239"/>
-      <w:bookmarkStart w:id="66" w:name="_Toc234745321"/>
+      <w:bookmarkStart w:id="65" w:name="_Toc234746412"/>
+      <w:bookmarkStart w:id="66" w:name="_Toc234746494"/>
       <w:r>
         <w:rPr>
           <w:b w:val="0"/>
@@ -9121,8 +9121,8 @@
       </w:pPr>
       <w:bookmarkStart w:id="67" w:name="_Toc230950255"/>
       <w:bookmarkStart w:id="68" w:name="_Toc234686795"/>
-      <w:bookmarkStart w:id="69" w:name="_Toc234745240"/>
-      <w:bookmarkStart w:id="70" w:name="_Toc234745322"/>
+      <w:bookmarkStart w:id="69" w:name="_Toc234746413"/>
+      <w:bookmarkStart w:id="70" w:name="_Toc234746495"/>
       <w:r>
         <w:rPr>
           <w:b w:val="0"/>
@@ -9207,8 +9207,8 @@
       </w:pPr>
       <w:bookmarkStart w:id="71" w:name="_Toc230950256"/>
       <w:bookmarkStart w:id="72" w:name="_Toc234686796"/>
-      <w:bookmarkStart w:id="73" w:name="_Toc234745241"/>
-      <w:bookmarkStart w:id="74" w:name="_Toc234745323"/>
+      <w:bookmarkStart w:id="73" w:name="_Toc234746414"/>
+      <w:bookmarkStart w:id="74" w:name="_Toc234746496"/>
       <w:r>
         <w:rPr>
           <w:b w:val="0"/>
@@ -9335,8 +9335,8 @@
       </w:pPr>
       <w:bookmarkStart w:id="75" w:name="_Toc230950257"/>
       <w:bookmarkStart w:id="76" w:name="_Toc234686797"/>
-      <w:bookmarkStart w:id="77" w:name="_Toc234745242"/>
-      <w:bookmarkStart w:id="78" w:name="_Toc234745324"/>
+      <w:bookmarkStart w:id="77" w:name="_Toc234746415"/>
+      <w:bookmarkStart w:id="78" w:name="_Toc234746497"/>
       <w:r>
         <w:rPr>
           <w:b w:val="0"/>
@@ -9483,8 +9483,8 @@
       </w:pPr>
       <w:bookmarkStart w:id="79" w:name="_Toc230950258"/>
       <w:bookmarkStart w:id="80" w:name="_Toc234686798"/>
-      <w:bookmarkStart w:id="81" w:name="_Toc234745243"/>
-      <w:bookmarkStart w:id="82" w:name="_Toc234745325"/>
+      <w:bookmarkStart w:id="81" w:name="_Toc234746416"/>
+      <w:bookmarkStart w:id="82" w:name="_Toc234746498"/>
       <w:r>
         <w:rPr>
           <w:b w:val="0"/>
@@ -9556,8 +9556,8 @@
       </w:pPr>
       <w:bookmarkStart w:id="83" w:name="_Toc230950259"/>
       <w:bookmarkStart w:id="84" w:name="_Toc234686799"/>
-      <w:bookmarkStart w:id="85" w:name="_Toc234745244"/>
-      <w:bookmarkStart w:id="86" w:name="_Toc234745326"/>
+      <w:bookmarkStart w:id="85" w:name="_Toc234746417"/>
+      <w:bookmarkStart w:id="86" w:name="_Toc234746499"/>
       <w:r>
         <w:rPr>
           <w:b w:val="0"/>
@@ -9686,8 +9686,8 @@
       </w:pPr>
       <w:bookmarkStart w:id="87" w:name="_Toc230950260"/>
       <w:bookmarkStart w:id="88" w:name="_Toc234686800"/>
-      <w:bookmarkStart w:id="89" w:name="_Toc234745245"/>
-      <w:bookmarkStart w:id="90" w:name="_Toc234745327"/>
+      <w:bookmarkStart w:id="89" w:name="_Toc234746418"/>
+      <w:bookmarkStart w:id="90" w:name="_Toc234746500"/>
       <w:r>
         <w:rPr>
           <w:b w:val="0"/>
@@ -9717,8 +9717,8 @@
       </w:pPr>
       <w:bookmarkStart w:id="91" w:name="_Toc230952643"/>
       <w:bookmarkStart w:id="92" w:name="_Toc234686847"/>
-      <w:bookmarkStart w:id="93" w:name="_Toc234745299"/>
-      <w:bookmarkStart w:id="94" w:name="_Toc234745381"/>
+      <w:bookmarkStart w:id="93" w:name="_Toc234746472"/>
+      <w:bookmarkStart w:id="94" w:name="_Toc234746554"/>
       <w:r>
         <w:t xml:space="preserve">Tabla </w:t>
       </w:r>
@@ -10296,8 +10296,8 @@
       </w:pPr>
       <w:bookmarkStart w:id="95" w:name="_Toc230950261"/>
       <w:bookmarkStart w:id="96" w:name="_Toc234686801"/>
-      <w:bookmarkStart w:id="97" w:name="_Toc234745246"/>
-      <w:bookmarkStart w:id="98" w:name="_Toc234745328"/>
+      <w:bookmarkStart w:id="97" w:name="_Toc234746419"/>
+      <w:bookmarkStart w:id="98" w:name="_Toc234746501"/>
       <w:r>
         <w:t>2.3. Conclusiones del capítulo</w:t>
       </w:r>
@@ -10381,8 +10381,8 @@
       </w:pPr>
       <w:bookmarkStart w:id="99" w:name="_Toc230950262"/>
       <w:bookmarkStart w:id="100" w:name="_Toc234686802"/>
-      <w:bookmarkStart w:id="101" w:name="_Toc234745247"/>
-      <w:bookmarkStart w:id="102" w:name="_Toc234745329"/>
+      <w:bookmarkStart w:id="101" w:name="_Toc234746420"/>
+      <w:bookmarkStart w:id="102" w:name="_Toc234746502"/>
       <w:r>
         <w:lastRenderedPageBreak/>
         <w:t>3. Objetivos concretos y metodología de trabajo</w:t>
@@ -10402,8 +10402,8 @@
       </w:pPr>
       <w:bookmarkStart w:id="103" w:name="_Toc230950263"/>
       <w:bookmarkStart w:id="104" w:name="_Toc234686803"/>
-      <w:bookmarkStart w:id="105" w:name="_Toc234745248"/>
-      <w:bookmarkStart w:id="106" w:name="_Toc234745330"/>
+      <w:bookmarkStart w:id="105" w:name="_Toc234746421"/>
+      <w:bookmarkStart w:id="106" w:name="_Toc234746503"/>
       <w:r>
         <w:t>3.1. Objetivo general</w:t>
       </w:r>
@@ -10427,8 +10427,8 @@
       </w:pPr>
       <w:bookmarkStart w:id="107" w:name="_Toc230950264"/>
       <w:bookmarkStart w:id="108" w:name="_Toc234686804"/>
-      <w:bookmarkStart w:id="109" w:name="_Toc234745249"/>
-      <w:bookmarkStart w:id="110" w:name="_Toc234745331"/>
+      <w:bookmarkStart w:id="109" w:name="_Toc234746422"/>
+      <w:bookmarkStart w:id="110" w:name="_Toc234746504"/>
       <w:r>
         <w:t>3.2. Objetivos específicos</w:t>
       </w:r>
@@ -10656,8 +10656,8 @@
       </w:pPr>
       <w:bookmarkStart w:id="111" w:name="_Toc230950265"/>
       <w:bookmarkStart w:id="112" w:name="_Toc234686805"/>
-      <w:bookmarkStart w:id="113" w:name="_Toc234745250"/>
-      <w:bookmarkStart w:id="114" w:name="_Toc234745332"/>
+      <w:bookmarkStart w:id="113" w:name="_Toc234746423"/>
+      <w:bookmarkStart w:id="114" w:name="_Toc234746505"/>
       <w:r>
         <w:t>3.3. Metodología del trabajo</w:t>
       </w:r>
@@ -10680,8 +10680,8 @@
       </w:pPr>
       <w:bookmarkStart w:id="115" w:name="_Toc230950266"/>
       <w:bookmarkStart w:id="116" w:name="_Toc234686806"/>
-      <w:bookmarkStart w:id="117" w:name="_Toc234745251"/>
-      <w:bookmarkStart w:id="118" w:name="_Toc234745333"/>
+      <w:bookmarkStart w:id="117" w:name="_Toc234746424"/>
+      <w:bookmarkStart w:id="118" w:name="_Toc234746506"/>
       <w:r>
         <w:rPr>
           <w:b w:val="0"/>
@@ -10720,8 +10720,8 @@
       </w:pPr>
       <w:bookmarkStart w:id="119" w:name="_Toc230950267"/>
       <w:bookmarkStart w:id="120" w:name="_Toc234686807"/>
-      <w:bookmarkStart w:id="121" w:name="_Toc234745252"/>
-      <w:bookmarkStart w:id="122" w:name="_Toc234745334"/>
+      <w:bookmarkStart w:id="121" w:name="_Toc234746425"/>
+      <w:bookmarkStart w:id="122" w:name="_Toc234746507"/>
       <w:r>
         <w:rPr>
           <w:rFonts w:ascii="Calibri Light" w:eastAsia="Calibri Light" w:hAnsi="Calibri Light" w:cs="Calibri Light"/>
@@ -10904,7 +10904,7 @@
                     <pic:cNvPicPr/>
                   </pic:nvPicPr>
                   <pic:blipFill>
-                    <a:blip r:embed="rId12"/>
+                    <a:blip r:embed="rId15"/>
                     <a:stretch>
                       <a:fillRect/>
                     </a:stretch>
@@ -10933,8 +10933,8 @@
       <w:bookmarkStart w:id="123" w:name="_Toc230952997"/>
       <w:bookmarkStart w:id="124" w:name="_Toc230961086"/>
       <w:bookmarkStart w:id="125" w:name="_Toc234686838"/>
-      <w:bookmarkStart w:id="126" w:name="_Toc234745290"/>
-      <w:bookmarkStart w:id="127" w:name="_Toc234745372"/>
+      <w:bookmarkStart w:id="126" w:name="_Toc234746463"/>
+      <w:bookmarkStart w:id="127" w:name="_Toc234746545"/>
       <w:r>
         <w:t xml:space="preserve">Figura </w:t>
       </w:r>
@@ -11135,7 +11135,7 @@
                     <pic:cNvPicPr/>
                   </pic:nvPicPr>
                   <pic:blipFill>
-                    <a:blip r:embed="rId12"/>
+                    <a:blip r:embed="rId16"/>
                     <a:stretch>
                       <a:fillRect/>
                     </a:stretch>
@@ -11164,8 +11164,8 @@
       <w:bookmarkStart w:id="128" w:name="_Toc230952998"/>
       <w:bookmarkStart w:id="129" w:name="_Toc230961087"/>
       <w:bookmarkStart w:id="130" w:name="_Toc234686839"/>
-      <w:bookmarkStart w:id="131" w:name="_Toc234745291"/>
-      <w:bookmarkStart w:id="132" w:name="_Toc234745373"/>
+      <w:bookmarkStart w:id="131" w:name="_Toc234746464"/>
+      <w:bookmarkStart w:id="132" w:name="_Toc234746546"/>
       <w:r>
         <w:t xml:space="preserve">Figura </w:t>
       </w:r>
@@ -11279,7 +11279,7 @@
                     <pic:cNvPicPr/>
                   </pic:nvPicPr>
                   <pic:blipFill>
-                    <a:blip r:embed="rId12"/>
+                    <a:blip r:embed="rId17"/>
                     <a:stretch>
                       <a:fillRect/>
                     </a:stretch>
@@ -11308,8 +11308,8 @@
       <w:bookmarkStart w:id="133" w:name="_Toc230952999"/>
       <w:bookmarkStart w:id="134" w:name="_Toc230961088"/>
       <w:bookmarkStart w:id="135" w:name="_Toc234686840"/>
-      <w:bookmarkStart w:id="136" w:name="_Toc234745292"/>
-      <w:bookmarkStart w:id="137" w:name="_Toc234745374"/>
+      <w:bookmarkStart w:id="136" w:name="_Toc234746465"/>
+      <w:bookmarkStart w:id="137" w:name="_Toc234746547"/>
       <w:r>
         <w:t xml:space="preserve">Figura </w:t>
       </w:r>
@@ -11405,8 +11405,8 @@
       </w:pPr>
       <w:bookmarkStart w:id="138" w:name="_Toc230950268"/>
       <w:bookmarkStart w:id="139" w:name="_Toc234686808"/>
-      <w:bookmarkStart w:id="140" w:name="_Toc234745253"/>
-      <w:bookmarkStart w:id="141" w:name="_Toc234745335"/>
+      <w:bookmarkStart w:id="140" w:name="_Toc234746426"/>
+      <w:bookmarkStart w:id="141" w:name="_Toc234746508"/>
       <w:r>
         <w:rPr>
           <w:b w:val="0"/>
@@ -11450,7 +11450,7 @@
                     <pic:cNvPicPr/>
                   </pic:nvPicPr>
                   <pic:blipFill>
-                    <a:blip r:embed="rId12"/>
+                    <a:blip r:embed="rId18"/>
                     <a:stretch>
                       <a:fillRect/>
                     </a:stretch>
@@ -11479,8 +11479,8 @@
       <w:bookmarkStart w:id="142" w:name="_Toc230953000"/>
       <w:bookmarkStart w:id="143" w:name="_Toc230961089"/>
       <w:bookmarkStart w:id="144" w:name="_Toc234686841"/>
-      <w:bookmarkStart w:id="145" w:name="_Toc234745293"/>
-      <w:bookmarkStart w:id="146" w:name="_Toc234745375"/>
+      <w:bookmarkStart w:id="145" w:name="_Toc234746466"/>
+      <w:bookmarkStart w:id="146" w:name="_Toc234746548"/>
       <w:r>
         <w:t xml:space="preserve">Figura </w:t>
       </w:r>
@@ -11546,8 +11546,8 @@
       </w:pPr>
       <w:bookmarkStart w:id="147" w:name="_Toc230950269"/>
       <w:bookmarkStart w:id="148" w:name="_Toc234686809"/>
-      <w:bookmarkStart w:id="149" w:name="_Toc234745254"/>
-      <w:bookmarkStart w:id="150" w:name="_Toc234745336"/>
+      <w:bookmarkStart w:id="149" w:name="_Toc234746427"/>
+      <w:bookmarkStart w:id="150" w:name="_Toc234746509"/>
       <w:r>
         <w:rPr>
           <w:b w:val="0"/>
@@ -11573,8 +11573,8 @@
       </w:pPr>
       <w:bookmarkStart w:id="151" w:name="_Toc230952644"/>
       <w:bookmarkStart w:id="152" w:name="_Toc234686848"/>
-      <w:bookmarkStart w:id="153" w:name="_Toc234745300"/>
-      <w:bookmarkStart w:id="154" w:name="_Toc234745382"/>
+      <w:bookmarkStart w:id="153" w:name="_Toc234746473"/>
+      <w:bookmarkStart w:id="154" w:name="_Toc234746555"/>
       <w:r>
         <w:t xml:space="preserve">Tabla </w:t>
       </w:r>
@@ -11868,8 +11868,8 @@
       </w:pPr>
       <w:bookmarkStart w:id="155" w:name="_Toc230950270"/>
       <w:bookmarkStart w:id="156" w:name="_Toc234686810"/>
-      <w:bookmarkStart w:id="157" w:name="_Toc234745255"/>
-      <w:bookmarkStart w:id="158" w:name="_Toc234745337"/>
+      <w:bookmarkStart w:id="157" w:name="_Toc234746428"/>
+      <w:bookmarkStart w:id="158" w:name="_Toc234746510"/>
       <w:r>
         <w:rPr>
           <w:b w:val="0"/>
@@ -11895,8 +11895,8 @@
       </w:pPr>
       <w:bookmarkStart w:id="159" w:name="_Toc230952645"/>
       <w:bookmarkStart w:id="160" w:name="_Toc234686849"/>
-      <w:bookmarkStart w:id="161" w:name="_Toc234745301"/>
-      <w:bookmarkStart w:id="162" w:name="_Toc234745383"/>
+      <w:bookmarkStart w:id="161" w:name="_Toc234746474"/>
+      <w:bookmarkStart w:id="162" w:name="_Toc234746556"/>
       <w:r>
         <w:t xml:space="preserve">Tabla </w:t>
       </w:r>
@@ -12279,8 +12279,8 @@
       </w:pPr>
       <w:bookmarkStart w:id="163" w:name="_Toc230950271"/>
       <w:bookmarkStart w:id="164" w:name="_Toc234686811"/>
-      <w:bookmarkStart w:id="165" w:name="_Toc234745256"/>
-      <w:bookmarkStart w:id="166" w:name="_Toc234745338"/>
+      <w:bookmarkStart w:id="165" w:name="_Toc234746429"/>
+      <w:bookmarkStart w:id="166" w:name="_Toc234746511"/>
       <w:r>
         <w:rPr>
           <w:rFonts w:ascii="Calibri Light" w:eastAsia="Calibri Light" w:hAnsi="Calibri Light" w:cs="Calibri Light"/>
@@ -12334,8 +12334,8 @@
       </w:pPr>
       <w:bookmarkStart w:id="167" w:name="_Toc230950272"/>
       <w:bookmarkStart w:id="168" w:name="_Toc234686812"/>
-      <w:bookmarkStart w:id="169" w:name="_Toc234745257"/>
-      <w:bookmarkStart w:id="170" w:name="_Toc234745339"/>
+      <w:bookmarkStart w:id="169" w:name="_Toc234746430"/>
+      <w:bookmarkStart w:id="170" w:name="_Toc234746512"/>
       <w:r>
         <w:rPr>
           <w:rFonts w:ascii="Calibri Light" w:eastAsia="Calibri Light" w:hAnsi="Calibri Light" w:cs="Calibri Light"/>
@@ -12663,8 +12663,8 @@
       </w:pPr>
       <w:bookmarkStart w:id="171" w:name="_Toc230950273"/>
       <w:bookmarkStart w:id="172" w:name="_Toc234686813"/>
-      <w:bookmarkStart w:id="173" w:name="_Toc234745258"/>
-      <w:bookmarkStart w:id="174" w:name="_Toc234745340"/>
+      <w:bookmarkStart w:id="173" w:name="_Toc234746431"/>
+      <w:bookmarkStart w:id="174" w:name="_Toc234746513"/>
       <w:r>
         <w:rPr>
           <w:rFonts w:ascii="Calibri Light" w:eastAsia="Calibri Light" w:hAnsi="Calibri Light" w:cs="Calibri Light"/>
@@ -12725,8 +12725,8 @@
       </w:pPr>
       <w:bookmarkStart w:id="175" w:name="_Toc230952646"/>
       <w:bookmarkStart w:id="176" w:name="_Toc234686850"/>
-      <w:bookmarkStart w:id="177" w:name="_Toc234745302"/>
-      <w:bookmarkStart w:id="178" w:name="_Toc234745384"/>
+      <w:bookmarkStart w:id="177" w:name="_Toc234746475"/>
+      <w:bookmarkStart w:id="178" w:name="_Toc234746557"/>
       <w:r>
         <w:t xml:space="preserve">Tabla </w:t>
       </w:r>
@@ -13677,8 +13677,8 @@
       </w:pPr>
       <w:bookmarkStart w:id="179" w:name="_Toc230950274"/>
       <w:bookmarkStart w:id="180" w:name="_Toc234686814"/>
-      <w:bookmarkStart w:id="181" w:name="_Toc234745259"/>
-      <w:bookmarkStart w:id="182" w:name="_Toc234745341"/>
+      <w:bookmarkStart w:id="181" w:name="_Toc234746432"/>
+      <w:bookmarkStart w:id="182" w:name="_Toc234746514"/>
       <w:r>
         <w:rPr>
           <w:rFonts w:ascii="Calibri Light" w:eastAsia="Calibri Light" w:hAnsi="Calibri Light" w:cs="Calibri Light"/>
@@ -13812,8 +13812,8 @@
       </w:pPr>
       <w:bookmarkStart w:id="183" w:name="_Toc230950275"/>
       <w:bookmarkStart w:id="184" w:name="_Toc234686815"/>
-      <w:bookmarkStart w:id="185" w:name="_Toc234745260"/>
-      <w:bookmarkStart w:id="186" w:name="_Toc234745342"/>
+      <w:bookmarkStart w:id="185" w:name="_Toc234746433"/>
+      <w:bookmarkStart w:id="186" w:name="_Toc234746515"/>
       <w:r>
         <w:rPr>
           <w:rFonts w:ascii="Calibri Light" w:eastAsia="Calibri Light" w:hAnsi="Calibri Light" w:cs="Calibri Light"/>
@@ -13913,8 +13913,8 @@
       </w:pPr>
       <w:bookmarkStart w:id="187" w:name="_Toc230950276"/>
       <w:bookmarkStart w:id="188" w:name="_Toc234686816"/>
-      <w:bookmarkStart w:id="189" w:name="_Toc234745261"/>
-      <w:bookmarkStart w:id="190" w:name="_Toc234745343"/>
+      <w:bookmarkStart w:id="189" w:name="_Toc234746434"/>
+      <w:bookmarkStart w:id="190" w:name="_Toc234746516"/>
       <w:r>
         <w:rPr>
           <w:rFonts w:ascii="Calibri Light" w:eastAsia="Calibri Light" w:hAnsi="Calibri Light" w:cs="Calibri Light"/>
@@ -14041,8 +14041,8 @@
       </w:pPr>
       <w:bookmarkStart w:id="191" w:name="_Toc230950277"/>
       <w:bookmarkStart w:id="192" w:name="_Toc234686817"/>
-      <w:bookmarkStart w:id="193" w:name="_Toc234745262"/>
-      <w:bookmarkStart w:id="194" w:name="_Toc234745344"/>
+      <w:bookmarkStart w:id="193" w:name="_Toc234746435"/>
+      <w:bookmarkStart w:id="194" w:name="_Toc234746517"/>
       <w:r>
         <w:rPr>
           <w:rFonts w:ascii="Calibri Light" w:eastAsia="Calibri Light" w:hAnsi="Calibri Light" w:cs="Calibri Light"/>
@@ -14114,8 +14114,8 @@
       </w:pPr>
       <w:bookmarkStart w:id="195" w:name="_Toc230950278"/>
       <w:bookmarkStart w:id="196" w:name="_Toc234686818"/>
-      <w:bookmarkStart w:id="197" w:name="_Toc234745263"/>
-      <w:bookmarkStart w:id="198" w:name="_Toc234745345"/>
+      <w:bookmarkStart w:id="197" w:name="_Toc234746436"/>
+      <w:bookmarkStart w:id="198" w:name="_Toc234746518"/>
       <w:r>
         <w:rPr>
           <w:rFonts w:ascii="Calibri Light" w:eastAsia="Calibri Light" w:hAnsi="Calibri Light" w:cs="Calibri Light"/>
@@ -14208,7 +14208,7 @@
                     <pic:cNvPicPr/>
                   </pic:nvPicPr>
                   <pic:blipFill>
-                    <a:blip r:embed="rId12">
+                    <a:blip r:embed="rId19">
                       <a:extLst>
                         <a:ext uri="{28A0092B-C50C-407E-A947-70E740481C1C}">
                           <a14:useLocalDpi xmlns:a14="http://schemas.microsoft.com/office/drawing/2010/main"/>
@@ -14243,8 +14243,8 @@
       <w:bookmarkStart w:id="199" w:name="_Toc230953001"/>
       <w:bookmarkStart w:id="200" w:name="_Toc230961090"/>
       <w:bookmarkStart w:id="201" w:name="_Toc234686842"/>
-      <w:bookmarkStart w:id="202" w:name="_Toc234745294"/>
-      <w:bookmarkStart w:id="203" w:name="_Toc234745376"/>
+      <w:bookmarkStart w:id="202" w:name="_Toc234746467"/>
+      <w:bookmarkStart w:id="203" w:name="_Toc234746549"/>
       <w:r>
         <w:t xml:space="preserve">Figura </w:t>
       </w:r>
@@ -14324,8 +14324,8 @@
       </w:pPr>
       <w:bookmarkStart w:id="204" w:name="_Toc230952647"/>
       <w:bookmarkStart w:id="205" w:name="_Toc234686851"/>
-      <w:bookmarkStart w:id="206" w:name="_Toc234745303"/>
-      <w:bookmarkStart w:id="207" w:name="_Toc234745385"/>
+      <w:bookmarkStart w:id="206" w:name="_Toc234746476"/>
+      <w:bookmarkStart w:id="207" w:name="_Toc234746558"/>
       <w:r>
         <w:t xml:space="preserve">Tabla </w:t>
       </w:r>
@@ -14831,8 +14831,8 @@
         </w:rPr>
       </w:pPr>
       <w:bookmarkStart w:id="208" w:name="_Toc234686819"/>
-      <w:bookmarkStart w:id="209" w:name="_Toc234745264"/>
-      <w:bookmarkStart w:id="210" w:name="_Toc234745346"/>
+      <w:bookmarkStart w:id="209" w:name="_Toc234746437"/>
+      <w:bookmarkStart w:id="210" w:name="_Toc234746519"/>
       <w:r>
         <w:rPr>
           <w:rFonts w:ascii="Calibri Light" w:eastAsia="Calibri Light" w:hAnsi="Calibri Light" w:cs="Calibri Light"/>
@@ -14926,8 +14926,8 @@
           <w:lang w:val="es-CO"/>
         </w:rPr>
       </w:pPr>
-      <w:bookmarkStart w:id="211" w:name="_Toc234745265"/>
-      <w:bookmarkStart w:id="212" w:name="_Toc234745347"/>
+      <w:bookmarkStart w:id="211" w:name="_Toc234746438"/>
+      <w:bookmarkStart w:id="212" w:name="_Toc234746520"/>
       <w:r>
         <w:rPr>
           <w:rFonts w:ascii="Calibri Light" w:eastAsia="Calibri Light" w:hAnsi="Calibri Light" w:cs="Calibri Light"/>
@@ -15012,8 +15012,8 @@
         <w:keepNext/>
         <w:jc w:val="left"/>
       </w:pPr>
-      <w:bookmarkStart w:id="213" w:name="_Toc234745304"/>
-      <w:bookmarkStart w:id="214" w:name="_Toc234745386"/>
+      <w:bookmarkStart w:id="213" w:name="_Toc234746477"/>
+      <w:bookmarkStart w:id="214" w:name="_Toc234746559"/>
       <w:r>
         <w:t xml:space="preserve">Tabla </w:t>
       </w:r>
@@ -15661,8 +15661,8 @@
       </w:pPr>
       <w:bookmarkStart w:id="215" w:name="_Toc230950279"/>
       <w:bookmarkStart w:id="216" w:name="_Toc234686820"/>
-      <w:bookmarkStart w:id="217" w:name="_Toc234745266"/>
-      <w:bookmarkStart w:id="218" w:name="_Toc234745348"/>
+      <w:bookmarkStart w:id="217" w:name="_Toc234746439"/>
+      <w:bookmarkStart w:id="218" w:name="_Toc234746521"/>
       <w:r>
         <w:rPr>
           <w:rFonts w:ascii="Calibri Light" w:eastAsia="Calibri Light" w:hAnsi="Calibri Light" w:cs="Calibri Light"/>
@@ -15995,7 +15995,7 @@
                     <pic:cNvPicPr/>
                   </pic:nvPicPr>
                   <pic:blipFill>
-                    <a:blip r:embed="rId12">
+                    <a:blip r:embed="rId20">
                       <a:extLst>
                         <a:ext uri="{28A0092B-C50C-407E-A947-70E740481C1C}">
                           <a14:useLocalDpi xmlns:a14="http://schemas.microsoft.com/office/drawing/2010/main"/>
@@ -16030,8 +16030,8 @@
       <w:bookmarkStart w:id="219" w:name="_Toc230953002"/>
       <w:bookmarkStart w:id="220" w:name="_Toc230961091"/>
       <w:bookmarkStart w:id="221" w:name="_Toc234686843"/>
-      <w:bookmarkStart w:id="222" w:name="_Toc234745295"/>
-      <w:bookmarkStart w:id="223" w:name="_Toc234745377"/>
+      <w:bookmarkStart w:id="222" w:name="_Toc234746468"/>
+      <w:bookmarkStart w:id="223" w:name="_Toc234746550"/>
       <w:r>
         <w:t xml:space="preserve">Figura </w:t>
       </w:r>
@@ -16346,8 +16346,8 @@
           <w:lang w:val="es-CO"/>
         </w:rPr>
       </w:pPr>
-      <w:bookmarkStart w:id="224" w:name="_Toc234745267"/>
-      <w:bookmarkStart w:id="225" w:name="_Toc234745349"/>
+      <w:bookmarkStart w:id="224" w:name="_Toc234746440"/>
+      <w:bookmarkStart w:id="225" w:name="_Toc234746522"/>
       <w:r>
         <w:rPr>
           <w:rFonts w:ascii="Calibri Light" w:eastAsia="Calibri Light" w:hAnsi="Calibri Light" w:cs="Calibri Light"/>
@@ -16465,8 +16465,8 @@
       </w:pPr>
       <w:bookmarkStart w:id="226" w:name="_Toc230950280"/>
       <w:bookmarkStart w:id="227" w:name="_Toc234686821"/>
-      <w:bookmarkStart w:id="228" w:name="_Toc234745268"/>
-      <w:bookmarkStart w:id="229" w:name="_Toc234745350"/>
+      <w:bookmarkStart w:id="228" w:name="_Toc234746441"/>
+      <w:bookmarkStart w:id="229" w:name="_Toc234746523"/>
       <w:r>
         <w:rPr>
           <w:rFonts w:ascii="Calibri Light" w:eastAsia="Calibri Light" w:hAnsi="Calibri Light" w:cs="Calibri Light"/>
@@ -16676,8 +16676,8 @@
       </w:pPr>
       <w:bookmarkStart w:id="230" w:name="_Toc230952648"/>
       <w:bookmarkStart w:id="231" w:name="_Toc234686852"/>
-      <w:bookmarkStart w:id="232" w:name="_Toc234745305"/>
-      <w:bookmarkStart w:id="233" w:name="_Toc234745387"/>
+      <w:bookmarkStart w:id="232" w:name="_Toc234746478"/>
+      <w:bookmarkStart w:id="233" w:name="_Toc234746560"/>
       <w:r>
         <w:t xml:space="preserve">Tabla </w:t>
       </w:r>
@@ -17492,7 +17492,7 @@
                     <pic:cNvPicPr/>
                   </pic:nvPicPr>
                   <pic:blipFill>
-                    <a:blip r:embed="rId12">
+                    <a:blip r:embed="rId21">
                       <a:extLst>
                         <a:ext uri="{28A0092B-C50C-407E-A947-70E740481C1C}">
                           <a14:useLocalDpi xmlns:a14="http://schemas.microsoft.com/office/drawing/2010/main"/>
@@ -17527,8 +17527,8 @@
       <w:bookmarkStart w:id="234" w:name="_Toc230953003"/>
       <w:bookmarkStart w:id="235" w:name="_Toc230961092"/>
       <w:bookmarkStart w:id="236" w:name="_Toc234686844"/>
-      <w:bookmarkStart w:id="237" w:name="_Toc234745296"/>
-      <w:bookmarkStart w:id="238" w:name="_Toc234745378"/>
+      <w:bookmarkStart w:id="237" w:name="_Toc234746469"/>
+      <w:bookmarkStart w:id="238" w:name="_Toc234746551"/>
       <w:r>
         <w:t xml:space="preserve">Figura </w:t>
       </w:r>
@@ -17635,8 +17635,8 @@
           <w:lang w:val="es-CO"/>
         </w:rPr>
       </w:pPr>
-      <w:bookmarkStart w:id="239" w:name="_Toc234745269"/>
-      <w:bookmarkStart w:id="240" w:name="_Toc234745351"/>
+      <w:bookmarkStart w:id="239" w:name="_Toc234746442"/>
+      <w:bookmarkStart w:id="240" w:name="_Toc234746524"/>
       <w:r>
         <w:rPr>
           <w:rFonts w:ascii="Calibri Light" w:eastAsia="Calibri Light" w:hAnsi="Calibri Light" w:cs="Calibri Light"/>
@@ -17762,8 +17762,8 @@
       </w:pPr>
       <w:bookmarkStart w:id="241" w:name="_Toc230950281"/>
       <w:bookmarkStart w:id="242" w:name="_Toc234686822"/>
-      <w:bookmarkStart w:id="243" w:name="_Toc234745270"/>
-      <w:bookmarkStart w:id="244" w:name="_Toc234745352"/>
+      <w:bookmarkStart w:id="243" w:name="_Toc234746443"/>
+      <w:bookmarkStart w:id="244" w:name="_Toc234746525"/>
       <w:r>
         <w:rPr>
           <w:rFonts w:ascii="Calibri Light" w:eastAsia="Calibri Light" w:hAnsi="Calibri Light" w:cs="Calibri Light"/>
@@ -17942,8 +17942,8 @@
         </w:rPr>
       </w:pPr>
       <w:bookmarkStart w:id="245" w:name="_Toc234686823"/>
-      <w:bookmarkStart w:id="246" w:name="_Toc234745271"/>
-      <w:bookmarkStart w:id="247" w:name="_Toc234745353"/>
+      <w:bookmarkStart w:id="246" w:name="_Toc234746444"/>
+      <w:bookmarkStart w:id="247" w:name="_Toc234746526"/>
       <w:r>
         <w:rPr>
           <w:rFonts w:ascii="Calibri Light" w:eastAsia="Calibri Light" w:hAnsi="Calibri Light" w:cs="Calibri Light"/>
@@ -18013,8 +18013,8 @@
         </w:rPr>
       </w:pPr>
       <w:bookmarkStart w:id="248" w:name="_Toc234686824"/>
-      <w:bookmarkStart w:id="249" w:name="_Toc234745272"/>
-      <w:bookmarkStart w:id="250" w:name="_Toc234745354"/>
+      <w:bookmarkStart w:id="249" w:name="_Toc234746445"/>
+      <w:bookmarkStart w:id="250" w:name="_Toc234746527"/>
       <w:r>
         <w:rPr>
           <w:rFonts w:ascii="Calibri Light" w:eastAsia="Calibri Light" w:hAnsi="Calibri Light" w:cs="Calibri Light"/>
@@ -18075,8 +18075,8 @@
           <w:lang w:val="es-CO"/>
         </w:rPr>
       </w:pPr>
-      <w:bookmarkStart w:id="251" w:name="_Toc234745273"/>
-      <w:bookmarkStart w:id="252" w:name="_Toc234745355"/>
+      <w:bookmarkStart w:id="251" w:name="_Toc234746446"/>
+      <w:bookmarkStart w:id="252" w:name="_Toc234746528"/>
       <w:r>
         <w:rPr>
           <w:rFonts w:ascii="Calibri Light" w:eastAsia="Calibri Light" w:hAnsi="Calibri Light" w:cs="Calibri Light"/>
@@ -18178,8 +18178,8 @@
       </w:pPr>
       <w:bookmarkStart w:id="253" w:name="_Toc230950282"/>
       <w:bookmarkStart w:id="254" w:name="_Toc234686825"/>
-      <w:bookmarkStart w:id="255" w:name="_Toc234745274"/>
-      <w:bookmarkStart w:id="256" w:name="_Toc234745356"/>
+      <w:bookmarkStart w:id="255" w:name="_Toc234746447"/>
+      <w:bookmarkStart w:id="256" w:name="_Toc234746529"/>
       <w:r>
         <w:rPr>
           <w:rFonts w:ascii="Calibri Light" w:eastAsia="Calibri Light" w:hAnsi="Calibri Light" w:cs="Calibri Light"/>
@@ -18367,8 +18367,8 @@
       </w:pPr>
       <w:bookmarkStart w:id="257" w:name="_Toc230952649"/>
       <w:bookmarkStart w:id="258" w:name="_Toc234686853"/>
-      <w:bookmarkStart w:id="259" w:name="_Toc234745306"/>
-      <w:bookmarkStart w:id="260" w:name="_Toc234745388"/>
+      <w:bookmarkStart w:id="259" w:name="_Toc234746479"/>
+      <w:bookmarkStart w:id="260" w:name="_Toc234746561"/>
       <w:r>
         <w:t xml:space="preserve">Tabla </w:t>
       </w:r>
@@ -19627,8 +19627,8 @@
       </w:pPr>
       <w:bookmarkStart w:id="261" w:name="_Toc230952650"/>
       <w:bookmarkStart w:id="262" w:name="_Toc234686854"/>
-      <w:bookmarkStart w:id="263" w:name="_Toc234745307"/>
-      <w:bookmarkStart w:id="264" w:name="_Toc234745389"/>
+      <w:bookmarkStart w:id="263" w:name="_Toc234746480"/>
+      <w:bookmarkStart w:id="264" w:name="_Toc234746562"/>
       <w:r>
         <w:t xml:space="preserve">Tabla </w:t>
       </w:r>
@@ -20661,7 +20661,7 @@
                     <pic:cNvPicPr/>
                   </pic:nvPicPr>
                   <pic:blipFill>
-                    <a:blip r:embed="rId12">
+                    <a:blip r:embed="rId22">
                       <a:extLst>
                         <a:ext uri="{28A0092B-C50C-407E-A947-70E740481C1C}">
                           <a14:useLocalDpi xmlns:a14="http://schemas.microsoft.com/office/drawing/2010/main"/>
@@ -20696,8 +20696,8 @@
       <w:bookmarkStart w:id="265" w:name="_Toc230953004"/>
       <w:bookmarkStart w:id="266" w:name="_Toc230961093"/>
       <w:bookmarkStart w:id="267" w:name="_Toc234686845"/>
-      <w:bookmarkStart w:id="268" w:name="_Toc234745297"/>
-      <w:bookmarkStart w:id="269" w:name="_Toc234745379"/>
+      <w:bookmarkStart w:id="268" w:name="_Toc234746470"/>
+      <w:bookmarkStart w:id="269" w:name="_Toc234746552"/>
       <w:r>
         <w:t xml:space="preserve">Figura </w:t>
       </w:r>
@@ -20781,8 +20781,8 @@
           <w:lang w:val="es-CO"/>
         </w:rPr>
       </w:pPr>
-      <w:bookmarkStart w:id="270" w:name="_Toc234745275"/>
-      <w:bookmarkStart w:id="271" w:name="_Toc234745357"/>
+      <w:bookmarkStart w:id="270" w:name="_Toc234746448"/>
+      <w:bookmarkStart w:id="271" w:name="_Toc234746530"/>
       <w:r>
         <w:rPr>
           <w:rFonts w:ascii="Calibri Light" w:eastAsia="Calibri Light" w:hAnsi="Calibri Light" w:cs="Calibri Light"/>
@@ -20900,8 +20900,8 @@
         </w:rPr>
       </w:pPr>
       <w:bookmarkStart w:id="272" w:name="_Toc234686826"/>
-      <w:bookmarkStart w:id="273" w:name="_Toc234745276"/>
-      <w:bookmarkStart w:id="274" w:name="_Toc234745358"/>
+      <w:bookmarkStart w:id="273" w:name="_Toc234746449"/>
+      <w:bookmarkStart w:id="274" w:name="_Toc234746531"/>
       <w:r>
         <w:rPr>
           <w:rFonts w:ascii="Calibri Light" w:eastAsia="Calibri Light" w:hAnsi="Calibri Light" w:cs="Calibri Light"/>
@@ -21101,8 +21101,8 @@
         <w:jc w:val="left"/>
       </w:pPr>
       <w:bookmarkStart w:id="275" w:name="_Toc234686855"/>
-      <w:bookmarkStart w:id="276" w:name="_Toc234745308"/>
-      <w:bookmarkStart w:id="277" w:name="_Toc234745390"/>
+      <w:bookmarkStart w:id="276" w:name="_Toc234746481"/>
+      <w:bookmarkStart w:id="277" w:name="_Toc234746563"/>
       <w:r>
         <w:t xml:space="preserve">Tabla </w:t>
       </w:r>
@@ -21498,8 +21498,8 @@
         </w:rPr>
       </w:pPr>
       <w:bookmarkStart w:id="278" w:name="_Toc234686827"/>
-      <w:bookmarkStart w:id="279" w:name="_Toc234745277"/>
-      <w:bookmarkStart w:id="280" w:name="_Toc234745359"/>
+      <w:bookmarkStart w:id="279" w:name="_Toc234746450"/>
+      <w:bookmarkStart w:id="280" w:name="_Toc234746532"/>
       <w:r>
         <w:rPr>
           <w:rFonts w:ascii="Calibri Light" w:eastAsia="Calibri Light" w:hAnsi="Calibri Light" w:cs="Calibri Light"/>
@@ -21665,8 +21665,8 @@
         <w:jc w:val="left"/>
       </w:pPr>
       <w:bookmarkStart w:id="281" w:name="_Toc234686856"/>
-      <w:bookmarkStart w:id="282" w:name="_Toc234745309"/>
-      <w:bookmarkStart w:id="283" w:name="_Toc234745391"/>
+      <w:bookmarkStart w:id="282" w:name="_Toc234746482"/>
+      <w:bookmarkStart w:id="283" w:name="_Toc234746564"/>
       <w:r>
         <w:t xml:space="preserve">Tabla </w:t>
       </w:r>
@@ -22459,8 +22459,8 @@
           <w:lang w:val="es-CO"/>
         </w:rPr>
       </w:pPr>
-      <w:bookmarkStart w:id="284" w:name="_Toc234745278"/>
-      <w:bookmarkStart w:id="285" w:name="_Toc234745360"/>
+      <w:bookmarkStart w:id="284" w:name="_Toc234746451"/>
+      <w:bookmarkStart w:id="285" w:name="_Toc234746533"/>
       <w:r>
         <w:rPr>
           <w:rFonts w:ascii="Calibri Light" w:eastAsia="Calibri Light" w:hAnsi="Calibri Light" w:cs="Calibri Light"/>
@@ -22552,8 +22552,8 @@
           <w:lang w:val="es-CO"/>
         </w:rPr>
       </w:pPr>
-      <w:bookmarkStart w:id="286" w:name="_Toc234745279"/>
-      <w:bookmarkStart w:id="287" w:name="_Toc234745361"/>
+      <w:bookmarkStart w:id="286" w:name="_Toc234746452"/>
+      <w:bookmarkStart w:id="287" w:name="_Toc234746534"/>
       <w:r>
         <w:rPr>
           <w:rFonts w:ascii="Calibri Light" w:eastAsia="Calibri Light" w:hAnsi="Calibri Light" w:cs="Calibri Light"/>
@@ -22664,8 +22664,8 @@
       </w:pPr>
       <w:bookmarkStart w:id="288" w:name="_Toc230950283"/>
       <w:bookmarkStart w:id="289" w:name="_Toc234686828"/>
-      <w:bookmarkStart w:id="290" w:name="_Toc234745280"/>
-      <w:bookmarkStart w:id="291" w:name="_Toc234745362"/>
+      <w:bookmarkStart w:id="290" w:name="_Toc234746453"/>
+      <w:bookmarkStart w:id="291" w:name="_Toc234746535"/>
       <w:r>
         <w:rPr>
           <w:rFonts w:ascii="Calibri Light" w:eastAsia="Calibri Light" w:hAnsi="Calibri Light" w:cs="Calibri Light"/>
@@ -22936,8 +22936,8 @@
       </w:pPr>
       <w:bookmarkStart w:id="292" w:name="_Toc230950284"/>
       <w:bookmarkStart w:id="293" w:name="_Toc234686829"/>
-      <w:bookmarkStart w:id="294" w:name="_Toc234745281"/>
-      <w:bookmarkStart w:id="295" w:name="_Toc234745363"/>
+      <w:bookmarkStart w:id="294" w:name="_Toc234746454"/>
+      <w:bookmarkStart w:id="295" w:name="_Toc234746536"/>
       <w:r>
         <w:rPr>
           <w:rFonts w:ascii="Calibri Light" w:eastAsia="Calibri Light" w:hAnsi="Calibri Light" w:cs="Calibri Light"/>
@@ -22967,8 +22967,8 @@
       </w:pPr>
       <w:bookmarkStart w:id="296" w:name="_Toc230950285"/>
       <w:bookmarkStart w:id="297" w:name="_Toc234686830"/>
-      <w:bookmarkStart w:id="298" w:name="_Toc234745282"/>
-      <w:bookmarkStart w:id="299" w:name="_Toc234745364"/>
+      <w:bookmarkStart w:id="298" w:name="_Toc234746455"/>
+      <w:bookmarkStart w:id="299" w:name="_Toc234746537"/>
       <w:r>
         <w:rPr>
           <w:rFonts w:ascii="Calibri Light" w:eastAsia="Calibri Light" w:hAnsi="Calibri Light" w:cs="Calibri Light"/>
@@ -23210,8 +23210,8 @@
       </w:pPr>
       <w:bookmarkStart w:id="300" w:name="_Toc230950286"/>
       <w:bookmarkStart w:id="301" w:name="_Toc234686831"/>
-      <w:bookmarkStart w:id="302" w:name="_Toc234745283"/>
-      <w:bookmarkStart w:id="303" w:name="_Toc234745365"/>
+      <w:bookmarkStart w:id="302" w:name="_Toc234746456"/>
+      <w:bookmarkStart w:id="303" w:name="_Toc234746538"/>
       <w:r>
         <w:rPr>
           <w:rFonts w:ascii="Calibri Light" w:eastAsia="Calibri Light" w:hAnsi="Calibri Light" w:cs="Calibri Light"/>
@@ -23608,8 +23608,8 @@
       </w:pPr>
       <w:bookmarkStart w:id="304" w:name="_Toc230950287"/>
       <w:bookmarkStart w:id="305" w:name="_Toc234686832"/>
-      <w:bookmarkStart w:id="306" w:name="_Toc234745284"/>
-      <w:bookmarkStart w:id="307" w:name="_Toc234745366"/>
+      <w:bookmarkStart w:id="306" w:name="_Toc234746457"/>
+      <w:bookmarkStart w:id="307" w:name="_Toc234746539"/>
       <w:r>
         <w:rPr>
           <w:rFonts w:ascii="Calibri Light" w:eastAsia="Calibri Light" w:hAnsi="Calibri Light" w:cs="Calibri Light"/>
@@ -23728,8 +23728,8 @@
       </w:pPr>
       <w:bookmarkStart w:id="308" w:name="_Toc230950288"/>
       <w:bookmarkStart w:id="309" w:name="_Toc234686833"/>
-      <w:bookmarkStart w:id="310" w:name="_Toc234745285"/>
-      <w:bookmarkStart w:id="311" w:name="_Toc234745367"/>
+      <w:bookmarkStart w:id="310" w:name="_Toc234746458"/>
+      <w:bookmarkStart w:id="311" w:name="_Toc234746540"/>
       <w:r>
         <w:lastRenderedPageBreak/>
         <w:t>Referencias bibliográficas</w:t>
@@ -24494,8 +24494,8 @@
       </w:pPr>
       <w:bookmarkStart w:id="312" w:name="_Toc230950289"/>
       <w:bookmarkStart w:id="313" w:name="_Toc234686834"/>
-      <w:bookmarkStart w:id="314" w:name="_Toc234745286"/>
-      <w:bookmarkStart w:id="315" w:name="_Toc234745368"/>
+      <w:bookmarkStart w:id="314" w:name="_Toc234746459"/>
+      <w:bookmarkStart w:id="315" w:name="_Toc234746541"/>
       <w:r>
         <w:lastRenderedPageBreak/>
         <w:t>Anexo A. Código fuente y datos analizados</w:t>
@@ -24519,7 +24519,7 @@
         </w:rPr>
         <w:t xml:space="preserve">El código fuente del TFM se aloja en el repositorio </w:t>
       </w:r>
-      <w:hyperlink r:id="rId13">
+      <w:hyperlink r:id="rId23">
         <w:r>
           <w:rPr>
             <w:rStyle w:val="Hyperlink"/>
@@ -25649,8 +25649,8 @@
       </w:r>
     </w:p>
     <w:sectPr>
-      <w:headerReference w:type="default" r:id="rId14"/>
-      <w:footerReference w:type="default" r:id="rId15"/>
+      <w:headerReference w:type="default" r:id="rId24"/>
+      <w:footerReference w:type="default" r:id="rId25"/>
       <w:pgSz w:w="11906" w:h="16838"/>
       <w:pgMar w:top="1418" w:right="1134" w:bottom="1418" w:left="1701" w:header="709" w:footer="709" w:gutter="0"/>
       <w:pgNumType w:start="1"/>

</xml_diff>